<commit_message>
Update Meu TCC Miguel Felipe Mendonça de Brito -  Atualizado 29do04de2026.docx
Revisão final
</commit_message>
<xml_diff>
--- a/Meu TCC Miguel Felipe Mendonça de Brito -  Atualizado 29do04de2026.docx
+++ b/Meu TCC Miguel Felipe Mendonça de Brito -  Atualizado 29do04de2026.docx
@@ -927,9 +927,6 @@
     </w:p>
     <w:p>
       <w:r>
-        <w:tab/>
-      </w:r>
-      <w:r>
         <w:t xml:space="preserve">Diante dessa carência, este trabalho tem como </w:t>
       </w:r>
       <w:r>
@@ -969,8 +966,19 @@
           <w:i/>
           <w:iCs/>
         </w:rPr>
-        <w:t>Design Thinking</w:t>
-      </w:r>
+        <w:t xml:space="preserve">Design </w:t>
+      </w:r>
+      <w:proofErr w:type="spellStart"/>
+      <w:r>
+        <w:rPr>
+          <w:b/>
+          <w:bCs/>
+          <w:i/>
+          <w:iCs/>
+        </w:rPr>
+        <w:t>Thinking</w:t>
+      </w:r>
+      <w:proofErr w:type="spellEnd"/>
       <w:r>
         <w:t xml:space="preserve">. </w:t>
       </w:r>
@@ -1190,25 +1198,35 @@
           <w:color w:val="000000" w:themeColor="text1"/>
           <w:lang w:val="en-US"/>
         </w:rPr>
-        <w:t>Internships represent an indispensable moment in the academic training of technical and higher education students, being crucial for the development of professional skills. At IFNMG – Campus Arinos, it is observed that students face difficulties in obtaining organized information about internship opportunities, since the dissemination occurs in a scattered manner, through social networks, messaging groups or verbal communication, compromising the credibility and visibility of the opportunities.</w:t>
-      </w:r>
-    </w:p>
-    <w:p>
-      <w:pPr>
+        <w:t xml:space="preserve">Internships represent an indispensable moment in the academic training of technical and higher education students, being crucial for the development of professional skills. At IFNMG – Campus </w:t>
+      </w:r>
+      <w:proofErr w:type="spellStart"/>
+      <w:r>
         <w:rPr>
           <w:rFonts w:asciiTheme="majorHAnsi" w:hAnsiTheme="majorHAnsi" w:cstheme="majorHAnsi"/>
           <w:color w:val="000000" w:themeColor="text1"/>
           <w:lang w:val="en-US"/>
         </w:rPr>
-      </w:pPr>
+        <w:t>Arinos</w:t>
+      </w:r>
+      <w:proofErr w:type="spellEnd"/>
       <w:r>
         <w:rPr>
           <w:rFonts w:asciiTheme="majorHAnsi" w:hAnsiTheme="majorHAnsi" w:cstheme="majorHAnsi"/>
           <w:color w:val="000000" w:themeColor="text1"/>
           <w:lang w:val="en-US"/>
         </w:rPr>
-        <w:tab/>
-      </w:r>
+        <w:t>, it is observed that students face difficulties in obtaining organized information about internship opportunities, since the dissemination occurs in a scattered manner, through social networks, messaging groups or verbal communication, compromising the credibility and visibility of the opportunities.</w:t>
+      </w:r>
+    </w:p>
+    <w:p>
+      <w:pPr>
+        <w:rPr>
+          <w:rFonts w:asciiTheme="majorHAnsi" w:hAnsiTheme="majorHAnsi" w:cstheme="majorHAnsi"/>
+          <w:color w:val="000000" w:themeColor="text1"/>
+          <w:lang w:val="en-US"/>
+        </w:rPr>
+      </w:pPr>
       <w:r>
         <w:rPr>
           <w:rFonts w:asciiTheme="majorHAnsi" w:hAnsiTheme="majorHAnsi" w:cstheme="majorHAnsi"/>
@@ -3831,38 +3849,40 @@
         </w:rPr>
         <w:t xml:space="preserve">  </w:t>
       </w:r>
+      <w:proofErr w:type="spellStart"/>
       <w:r>
         <w:rPr>
           <w:rFonts w:asciiTheme="majorHAnsi" w:hAnsiTheme="majorHAnsi" w:cstheme="majorHAnsi"/>
           <w:color w:val="000000" w:themeColor="text1"/>
           <w:lang w:val="en-US"/>
         </w:rPr>
-        <w:t>Processo de software e o Unified Process</w:t>
-      </w:r>
-    </w:p>
-    <w:p>
-      <w:pPr>
+        <w:t>Processo</w:t>
+      </w:r>
+      <w:proofErr w:type="spellEnd"/>
+      <w:r>
         <w:rPr>
           <w:rFonts w:asciiTheme="majorHAnsi" w:hAnsiTheme="majorHAnsi" w:cstheme="majorHAnsi"/>
           <w:color w:val="000000" w:themeColor="text1"/>
           <w:lang w:val="en-US"/>
         </w:rPr>
-      </w:pPr>
-      <w:r>
+        <w:t xml:space="preserve"> de software e o Unified Process</w:t>
+      </w:r>
+    </w:p>
+    <w:p>
+      <w:pPr>
         <w:rPr>
           <w:rFonts w:asciiTheme="majorHAnsi" w:hAnsiTheme="majorHAnsi" w:cstheme="majorHAnsi"/>
           <w:color w:val="000000" w:themeColor="text1"/>
           <w:lang w:val="en-US"/>
         </w:rPr>
-        <w:t xml:space="preserve">UML </w:t>
-      </w:r>
+      </w:pPr>
       <w:r>
         <w:rPr>
           <w:rFonts w:asciiTheme="majorHAnsi" w:hAnsiTheme="majorHAnsi" w:cstheme="majorHAnsi"/>
           <w:color w:val="000000" w:themeColor="text1"/>
           <w:lang w:val="en-US"/>
         </w:rPr>
-        <w:t xml:space="preserve">             </w:t>
+        <w:t xml:space="preserve">UML </w:t>
       </w:r>
       <w:r>
         <w:rPr>
@@ -3870,7 +3890,7 @@
           <w:color w:val="000000" w:themeColor="text1"/>
           <w:lang w:val="en-US"/>
         </w:rPr>
-        <w:t xml:space="preserve">  </w:t>
+        <w:t xml:space="preserve">             </w:t>
       </w:r>
       <w:r>
         <w:rPr>
@@ -3878,7 +3898,7 @@
           <w:color w:val="000000" w:themeColor="text1"/>
           <w:lang w:val="en-US"/>
         </w:rPr>
-        <w:t xml:space="preserve"> </w:t>
+        <w:t xml:space="preserve">  </w:t>
       </w:r>
       <w:r>
         <w:rPr>
@@ -3894,40 +3914,42 @@
           <w:color w:val="000000" w:themeColor="text1"/>
           <w:lang w:val="en-US"/>
         </w:rPr>
-        <w:t>Unified Modeling Langague</w:t>
-      </w:r>
-    </w:p>
-    <w:p>
-      <w:pPr>
+        <w:t xml:space="preserve"> </w:t>
+      </w:r>
+      <w:r>
         <w:rPr>
           <w:rFonts w:asciiTheme="majorHAnsi" w:hAnsiTheme="majorHAnsi" w:cstheme="majorHAnsi"/>
           <w:color w:val="000000" w:themeColor="text1"/>
           <w:lang w:val="en-US"/>
         </w:rPr>
-      </w:pPr>
+        <w:t xml:space="preserve">Unified Modeling </w:t>
+      </w:r>
+      <w:proofErr w:type="spellStart"/>
       <w:r>
         <w:rPr>
           <w:rFonts w:asciiTheme="majorHAnsi" w:hAnsiTheme="majorHAnsi" w:cstheme="majorHAnsi"/>
           <w:color w:val="000000" w:themeColor="text1"/>
           <w:lang w:val="en-US"/>
         </w:rPr>
-        <w:t xml:space="preserve">ER         </w:t>
-      </w:r>
-      <w:r>
+        <w:t>Langague</w:t>
+      </w:r>
+      <w:proofErr w:type="spellEnd"/>
+    </w:p>
+    <w:p>
+      <w:pPr>
         <w:rPr>
           <w:rFonts w:asciiTheme="majorHAnsi" w:hAnsiTheme="majorHAnsi" w:cstheme="majorHAnsi"/>
           <w:color w:val="000000" w:themeColor="text1"/>
           <w:lang w:val="en-US"/>
         </w:rPr>
-        <w:t xml:space="preserve"> </w:t>
-      </w:r>
+      </w:pPr>
       <w:r>
         <w:rPr>
           <w:rFonts w:asciiTheme="majorHAnsi" w:hAnsiTheme="majorHAnsi" w:cstheme="majorHAnsi"/>
           <w:color w:val="000000" w:themeColor="text1"/>
           <w:lang w:val="en-US"/>
         </w:rPr>
-        <w:t xml:space="preserve">   </w:t>
+        <w:t xml:space="preserve">ER         </w:t>
       </w:r>
       <w:r>
         <w:rPr>
@@ -3935,7 +3957,7 @@
           <w:color w:val="000000" w:themeColor="text1"/>
           <w:lang w:val="en-US"/>
         </w:rPr>
-        <w:t xml:space="preserve">        </w:t>
+        <w:t xml:space="preserve"> </w:t>
       </w:r>
       <w:r>
         <w:rPr>
@@ -3943,8 +3965,44 @@
           <w:color w:val="000000" w:themeColor="text1"/>
           <w:lang w:val="en-US"/>
         </w:rPr>
-        <w:t>Engenharia de Requisitos</w:t>
-      </w:r>
+        <w:t xml:space="preserve">   </w:t>
+      </w:r>
+      <w:r>
+        <w:rPr>
+          <w:rFonts w:asciiTheme="majorHAnsi" w:hAnsiTheme="majorHAnsi" w:cstheme="majorHAnsi"/>
+          <w:color w:val="000000" w:themeColor="text1"/>
+          <w:lang w:val="en-US"/>
+        </w:rPr>
+        <w:t xml:space="preserve">        </w:t>
+      </w:r>
+      <w:proofErr w:type="spellStart"/>
+      <w:r>
+        <w:rPr>
+          <w:rFonts w:asciiTheme="majorHAnsi" w:hAnsiTheme="majorHAnsi" w:cstheme="majorHAnsi"/>
+          <w:color w:val="000000" w:themeColor="text1"/>
+          <w:lang w:val="en-US"/>
+        </w:rPr>
+        <w:t>Engenharia</w:t>
+      </w:r>
+      <w:proofErr w:type="spellEnd"/>
+      <w:r>
+        <w:rPr>
+          <w:rFonts w:asciiTheme="majorHAnsi" w:hAnsiTheme="majorHAnsi" w:cstheme="majorHAnsi"/>
+          <w:color w:val="000000" w:themeColor="text1"/>
+          <w:lang w:val="en-US"/>
+        </w:rPr>
+        <w:t xml:space="preserve"> de </w:t>
+      </w:r>
+      <w:proofErr w:type="spellStart"/>
+      <w:r>
+        <w:rPr>
+          <w:rFonts w:asciiTheme="majorHAnsi" w:hAnsiTheme="majorHAnsi" w:cstheme="majorHAnsi"/>
+          <w:color w:val="000000" w:themeColor="text1"/>
+          <w:lang w:val="en-US"/>
+        </w:rPr>
+        <w:t>Requisitos</w:t>
+      </w:r>
+      <w:proofErr w:type="spellEnd"/>
     </w:p>
     <w:p>
       <w:pPr>
@@ -4103,7 +4161,7 @@
             </w:rPr>
             <w:fldChar w:fldCharType="separate"/>
           </w:r>
-          <w:hyperlink w:anchor="_Toc227939346" w:history="1">
+          <w:hyperlink w:anchor="_Toc228614384" w:history="1">
             <w:r>
               <w:rPr>
                 <w:rStyle w:val="Hyperlink"/>
@@ -4148,7 +4206,7 @@
                 <w:noProof/>
                 <w:webHidden/>
               </w:rPr>
-              <w:instrText xml:space="preserve"> PAGEREF _Toc227939346 \h </w:instrText>
+              <w:instrText xml:space="preserve"> PAGEREF _Toc228614384 \h </w:instrText>
             </w:r>
             <w:r>
               <w:rPr>
@@ -4196,7 +4254,7 @@
               <w14:ligatures w14:val="standardContextual"/>
             </w:rPr>
           </w:pPr>
-          <w:hyperlink w:anchor="_Toc227939347" w:history="1">
+          <w:hyperlink w:anchor="_Toc228614385" w:history="1">
             <w:r>
               <w:rPr>
                 <w:rStyle w:val="Hyperlink"/>
@@ -4244,7 +4302,7 @@
                 <w:noProof/>
                 <w:webHidden/>
               </w:rPr>
-              <w:instrText xml:space="preserve"> PAGEREF _Toc227939347 \h </w:instrText>
+              <w:instrText xml:space="preserve"> PAGEREF _Toc228614385 \h </w:instrText>
             </w:r>
             <w:r>
               <w:rPr>
@@ -4292,7 +4350,7 @@
               <w14:ligatures w14:val="standardContextual"/>
             </w:rPr>
           </w:pPr>
-          <w:hyperlink w:anchor="_Toc227939348" w:history="1">
+          <w:hyperlink w:anchor="_Toc228614386" w:history="1">
             <w:r>
               <w:rPr>
                 <w:rStyle w:val="Hyperlink"/>
@@ -4340,7 +4398,7 @@
                 <w:noProof/>
                 <w:webHidden/>
               </w:rPr>
-              <w:instrText xml:space="preserve"> PAGEREF _Toc227939348 \h </w:instrText>
+              <w:instrText xml:space="preserve"> PAGEREF _Toc228614386 \h </w:instrText>
             </w:r>
             <w:r>
               <w:rPr>
@@ -4383,7 +4441,7 @@
               <w14:ligatures w14:val="standardContextual"/>
             </w:rPr>
           </w:pPr>
-          <w:hyperlink w:anchor="_Toc227939349" w:history="1">
+          <w:hyperlink w:anchor="_Toc228614387" w:history="1">
             <w:r>
               <w:rPr>
                 <w:rStyle w:val="Hyperlink"/>
@@ -4428,7 +4486,7 @@
                 <w:noProof/>
                 <w:webHidden/>
               </w:rPr>
-              <w:instrText xml:space="preserve"> PAGEREF _Toc227939349 \h </w:instrText>
+              <w:instrText xml:space="preserve"> PAGEREF _Toc228614387 \h </w:instrText>
             </w:r>
             <w:r>
               <w:rPr>
@@ -4476,7 +4534,7 @@
               <w14:ligatures w14:val="standardContextual"/>
             </w:rPr>
           </w:pPr>
-          <w:hyperlink w:anchor="_Toc227939350" w:history="1">
+          <w:hyperlink w:anchor="_Toc228614388" w:history="1">
             <w:r>
               <w:rPr>
                 <w:rStyle w:val="Hyperlink"/>
@@ -4524,7 +4582,7 @@
                 <w:noProof/>
                 <w:webHidden/>
               </w:rPr>
-              <w:instrText xml:space="preserve"> PAGEREF _Toc227939350 \h </w:instrText>
+              <w:instrText xml:space="preserve"> PAGEREF _Toc228614388 \h </w:instrText>
             </w:r>
             <w:r>
               <w:rPr>
@@ -4572,7 +4630,7 @@
               <w14:ligatures w14:val="standardContextual"/>
             </w:rPr>
           </w:pPr>
-          <w:hyperlink w:anchor="_Toc227939351" w:history="1">
+          <w:hyperlink w:anchor="_Toc228614389" w:history="1">
             <w:r>
               <w:rPr>
                 <w:rStyle w:val="Hyperlink"/>
@@ -4620,7 +4678,7 @@
                 <w:noProof/>
                 <w:webHidden/>
               </w:rPr>
-              <w:instrText xml:space="preserve"> PAGEREF _Toc227939351 \h </w:instrText>
+              <w:instrText xml:space="preserve"> PAGEREF _Toc228614389 \h </w:instrText>
             </w:r>
             <w:r>
               <w:rPr>
@@ -4668,7 +4726,7 @@
               <w14:ligatures w14:val="standardContextual"/>
             </w:rPr>
           </w:pPr>
-          <w:hyperlink w:anchor="_Toc227939352" w:history="1">
+          <w:hyperlink w:anchor="_Toc228614390" w:history="1">
             <w:r>
               <w:rPr>
                 <w:rStyle w:val="Hyperlink"/>
@@ -4716,7 +4774,7 @@
                 <w:noProof/>
                 <w:webHidden/>
               </w:rPr>
-              <w:instrText xml:space="preserve"> PAGEREF _Toc227939352 \h </w:instrText>
+              <w:instrText xml:space="preserve"> PAGEREF _Toc228614390 \h </w:instrText>
             </w:r>
             <w:r>
               <w:rPr>
@@ -4764,7 +4822,7 @@
               <w14:ligatures w14:val="standardContextual"/>
             </w:rPr>
           </w:pPr>
-          <w:hyperlink w:anchor="_Toc227939353" w:history="1">
+          <w:hyperlink w:anchor="_Toc228614391" w:history="1">
             <w:r>
               <w:rPr>
                 <w:rStyle w:val="Hyperlink"/>
@@ -4812,7 +4870,7 @@
                 <w:noProof/>
                 <w:webHidden/>
               </w:rPr>
-              <w:instrText xml:space="preserve"> PAGEREF _Toc227939353 \h </w:instrText>
+              <w:instrText xml:space="preserve"> PAGEREF _Toc228614391 \h </w:instrText>
             </w:r>
             <w:r>
               <w:rPr>
@@ -4859,7 +4917,7 @@
               <w14:ligatures w14:val="standardContextual"/>
             </w:rPr>
           </w:pPr>
-          <w:hyperlink w:anchor="_Toc227939354" w:history="1">
+          <w:hyperlink w:anchor="_Toc228614392" w:history="1">
             <w:r>
               <w:rPr>
                 <w:rStyle w:val="Hyperlink"/>
@@ -4905,7 +4963,7 @@
                 <w:noProof/>
                 <w:webHidden/>
               </w:rPr>
-              <w:instrText xml:space="preserve"> PAGEREF _Toc227939354 \h </w:instrText>
+              <w:instrText xml:space="preserve"> PAGEREF _Toc228614392 \h </w:instrText>
             </w:r>
             <w:r>
               <w:rPr>
@@ -4952,7 +5010,7 @@
               <w14:ligatures w14:val="standardContextual"/>
             </w:rPr>
           </w:pPr>
-          <w:hyperlink w:anchor="_Toc227939355" w:history="1">
+          <w:hyperlink w:anchor="_Toc228614393" w:history="1">
             <w:r>
               <w:rPr>
                 <w:rStyle w:val="Hyperlink"/>
@@ -4998,7 +5056,7 @@
                 <w:noProof/>
                 <w:webHidden/>
               </w:rPr>
-              <w:instrText xml:space="preserve"> PAGEREF _Toc227939355 \h </w:instrText>
+              <w:instrText xml:space="preserve"> PAGEREF _Toc228614393 \h </w:instrText>
             </w:r>
             <w:r>
               <w:rPr>
@@ -5045,7 +5103,7 @@
               <w14:ligatures w14:val="standardContextual"/>
             </w:rPr>
           </w:pPr>
-          <w:hyperlink w:anchor="_Toc227939356" w:history="1">
+          <w:hyperlink w:anchor="_Toc228614394" w:history="1">
             <w:r>
               <w:rPr>
                 <w:rStyle w:val="Hyperlink"/>
@@ -5091,7 +5149,7 @@
                 <w:noProof/>
                 <w:webHidden/>
               </w:rPr>
-              <w:instrText xml:space="preserve"> PAGEREF _Toc227939356 \h </w:instrText>
+              <w:instrText xml:space="preserve"> PAGEREF _Toc228614394 \h </w:instrText>
             </w:r>
             <w:r>
               <w:rPr>
@@ -5139,7 +5197,7 @@
               <w14:ligatures w14:val="standardContextual"/>
             </w:rPr>
           </w:pPr>
-          <w:hyperlink w:anchor="_Toc227939357" w:history="1">
+          <w:hyperlink w:anchor="_Toc228614395" w:history="1">
             <w:r>
               <w:rPr>
                 <w:rStyle w:val="Hyperlink"/>
@@ -5187,7 +5245,7 @@
                 <w:noProof/>
                 <w:webHidden/>
               </w:rPr>
-              <w:instrText xml:space="preserve"> PAGEREF _Toc227939357 \h </w:instrText>
+              <w:instrText xml:space="preserve"> PAGEREF _Toc228614395 \h </w:instrText>
             </w:r>
             <w:r>
               <w:rPr>
@@ -5234,7 +5292,7 @@
               <w14:ligatures w14:val="standardContextual"/>
             </w:rPr>
           </w:pPr>
-          <w:hyperlink w:anchor="_Toc227939358" w:history="1">
+          <w:hyperlink w:anchor="_Toc228614396" w:history="1">
             <w:r>
               <w:rPr>
                 <w:rStyle w:val="Hyperlink"/>
@@ -5280,7 +5338,7 @@
                 <w:noProof/>
                 <w:webHidden/>
               </w:rPr>
-              <w:instrText xml:space="preserve"> PAGEREF _Toc227939358 \h </w:instrText>
+              <w:instrText xml:space="preserve"> PAGEREF _Toc228614396 \h </w:instrText>
             </w:r>
             <w:r>
               <w:rPr>
@@ -5328,7 +5386,7 @@
               <w14:ligatures w14:val="standardContextual"/>
             </w:rPr>
           </w:pPr>
-          <w:hyperlink w:anchor="_Toc227939359" w:history="1">
+          <w:hyperlink w:anchor="_Toc228614397" w:history="1">
             <w:r>
               <w:rPr>
                 <w:rStyle w:val="Hyperlink"/>
@@ -5376,7 +5434,7 @@
                 <w:noProof/>
                 <w:webHidden/>
               </w:rPr>
-              <w:instrText xml:space="preserve"> PAGEREF _Toc227939359 \h </w:instrText>
+              <w:instrText xml:space="preserve"> PAGEREF _Toc228614397 \h </w:instrText>
             </w:r>
             <w:r>
               <w:rPr>
@@ -5423,7 +5481,7 @@
               <w14:ligatures w14:val="standardContextual"/>
             </w:rPr>
           </w:pPr>
-          <w:hyperlink w:anchor="_Toc227939360" w:history="1">
+          <w:hyperlink w:anchor="_Toc228614398" w:history="1">
             <w:r>
               <w:rPr>
                 <w:rStyle w:val="Hyperlink"/>
@@ -5469,7 +5527,7 @@
                 <w:noProof/>
                 <w:webHidden/>
               </w:rPr>
-              <w:instrText xml:space="preserve"> PAGEREF _Toc227939360 \h </w:instrText>
+              <w:instrText xml:space="preserve"> PAGEREF _Toc228614398 \h </w:instrText>
             </w:r>
             <w:r>
               <w:rPr>
@@ -5512,7 +5570,7 @@
               <w14:ligatures w14:val="standardContextual"/>
             </w:rPr>
           </w:pPr>
-          <w:hyperlink w:anchor="_Toc227939361" w:history="1">
+          <w:hyperlink w:anchor="_Toc228614399" w:history="1">
             <w:r>
               <w:rPr>
                 <w:rStyle w:val="Hyperlink"/>
@@ -5557,7 +5615,7 @@
                 <w:noProof/>
                 <w:webHidden/>
               </w:rPr>
-              <w:instrText xml:space="preserve"> PAGEREF _Toc227939361 \h </w:instrText>
+              <w:instrText xml:space="preserve"> PAGEREF _Toc228614399 \h </w:instrText>
             </w:r>
             <w:r>
               <w:rPr>
@@ -5605,7 +5663,7 @@
               <w14:ligatures w14:val="standardContextual"/>
             </w:rPr>
           </w:pPr>
-          <w:hyperlink w:anchor="_Toc227939362" w:history="1">
+          <w:hyperlink w:anchor="_Toc228614400" w:history="1">
             <w:r>
               <w:rPr>
                 <w:rStyle w:val="Hyperlink"/>
@@ -5653,7 +5711,7 @@
                 <w:noProof/>
                 <w:webHidden/>
               </w:rPr>
-              <w:instrText xml:space="preserve"> PAGEREF _Toc227939362 \h </w:instrText>
+              <w:instrText xml:space="preserve"> PAGEREF _Toc228614400 \h </w:instrText>
             </w:r>
             <w:r>
               <w:rPr>
@@ -5701,7 +5759,7 @@
               <w14:ligatures w14:val="standardContextual"/>
             </w:rPr>
           </w:pPr>
-          <w:hyperlink w:anchor="_Toc227939363" w:history="1">
+          <w:hyperlink w:anchor="_Toc228614401" w:history="1">
             <w:r>
               <w:rPr>
                 <w:rStyle w:val="Hyperlink"/>
@@ -5749,7 +5807,7 @@
                 <w:noProof/>
                 <w:webHidden/>
               </w:rPr>
-              <w:instrText xml:space="preserve"> PAGEREF _Toc227939363 \h </w:instrText>
+              <w:instrText xml:space="preserve"> PAGEREF _Toc228614401 \h </w:instrText>
             </w:r>
             <w:r>
               <w:rPr>
@@ -5792,7 +5850,7 @@
               <w14:ligatures w14:val="standardContextual"/>
             </w:rPr>
           </w:pPr>
-          <w:hyperlink w:anchor="_Toc227939364" w:history="1">
+          <w:hyperlink w:anchor="_Toc228614402" w:history="1">
             <w:r>
               <w:rPr>
                 <w:rStyle w:val="Hyperlink"/>
@@ -5816,7 +5874,14 @@
                 <w:rStyle w:val="Hyperlink"/>
                 <w:noProof/>
               </w:rPr>
-              <w:t>RESULTADOS e analises</w:t>
+              <w:t xml:space="preserve">RESULTADOS </w:t>
+            </w:r>
+            <w:r>
+              <w:rPr>
+                <w:rStyle w:val="Hyperlink"/>
+                <w:noProof/>
+              </w:rPr>
+              <w:t>E ANALISES</w:t>
             </w:r>
             <w:r>
               <w:rPr>
@@ -5837,7 +5902,7 @@
                 <w:noProof/>
                 <w:webHidden/>
               </w:rPr>
-              <w:instrText xml:space="preserve"> PAGEREF _Toc227939364 \h </w:instrText>
+              <w:instrText xml:space="preserve"> PAGEREF _Toc228614402 \h </w:instrText>
             </w:r>
             <w:r>
               <w:rPr>
@@ -5885,7 +5950,7 @@
               <w14:ligatures w14:val="standardContextual"/>
             </w:rPr>
           </w:pPr>
-          <w:hyperlink w:anchor="_Toc227939365" w:history="1">
+          <w:hyperlink w:anchor="_Toc228614403" w:history="1">
             <w:r>
               <w:rPr>
                 <w:rStyle w:val="Hyperlink"/>
@@ -5933,7 +5998,7 @@
                 <w:noProof/>
                 <w:webHidden/>
               </w:rPr>
-              <w:instrText xml:space="preserve"> PAGEREF _Toc227939365 \h </w:instrText>
+              <w:instrText xml:space="preserve"> PAGEREF _Toc228614403 \h </w:instrText>
             </w:r>
             <w:r>
               <w:rPr>
@@ -5981,7 +6046,7 @@
               <w14:ligatures w14:val="standardContextual"/>
             </w:rPr>
           </w:pPr>
-          <w:hyperlink w:anchor="_Toc227939366" w:history="1">
+          <w:hyperlink w:anchor="_Toc228614404" w:history="1">
             <w:r>
               <w:rPr>
                 <w:rStyle w:val="Hyperlink"/>
@@ -6029,7 +6094,7 @@
                 <w:noProof/>
                 <w:webHidden/>
               </w:rPr>
-              <w:instrText xml:space="preserve"> PAGEREF _Toc227939366 \h </w:instrText>
+              <w:instrText xml:space="preserve"> PAGEREF _Toc228614404 \h </w:instrText>
             </w:r>
             <w:r>
               <w:rPr>
@@ -6077,7 +6142,7 @@
               <w14:ligatures w14:val="standardContextual"/>
             </w:rPr>
           </w:pPr>
-          <w:hyperlink w:anchor="_Toc227939367" w:history="1">
+          <w:hyperlink w:anchor="_Toc228614405" w:history="1">
             <w:r>
               <w:rPr>
                 <w:rStyle w:val="Hyperlink"/>
@@ -6125,7 +6190,7 @@
                 <w:noProof/>
                 <w:webHidden/>
               </w:rPr>
-              <w:instrText xml:space="preserve"> PAGEREF _Toc227939367 \h </w:instrText>
+              <w:instrText xml:space="preserve"> PAGEREF _Toc228614405 \h </w:instrText>
             </w:r>
             <w:r>
               <w:rPr>
@@ -6173,7 +6238,7 @@
               <w14:ligatures w14:val="standardContextual"/>
             </w:rPr>
           </w:pPr>
-          <w:hyperlink w:anchor="_Toc227939370" w:history="1">
+          <w:hyperlink w:anchor="_Toc228614407" w:history="1">
             <w:r>
               <w:rPr>
                 <w:rStyle w:val="Hyperlink"/>
@@ -6200,7 +6265,7 @@
                 <w:rStyle w:val="Hyperlink"/>
                 <w:noProof/>
               </w:rPr>
-              <w:t>PESQUISA DE USABILIDADE E DE EXPERIÊNCIA DO USUÁRIO</w:t>
+              <w:t>USABILIDADE E EXPERIÊNCIA DO USUÁRIO</w:t>
             </w:r>
             <w:r>
               <w:rPr>
@@ -6221,7 +6286,7 @@
                 <w:noProof/>
                 <w:webHidden/>
               </w:rPr>
-              <w:instrText xml:space="preserve"> PAGEREF _Toc227939370 \h </w:instrText>
+              <w:instrText xml:space="preserve"> PAGEREF _Toc228614407 \h </w:instrText>
             </w:r>
             <w:r>
               <w:rPr>
@@ -6241,7 +6306,7 @@
                 <w:noProof/>
                 <w:webHidden/>
               </w:rPr>
-              <w:t>29</w:t>
+              <w:t>28</w:t>
             </w:r>
             <w:r>
               <w:rPr>
@@ -6264,7 +6329,7 @@
               <w14:ligatures w14:val="standardContextual"/>
             </w:rPr>
           </w:pPr>
-          <w:hyperlink w:anchor="_Toc227939371" w:history="1">
+          <w:hyperlink w:anchor="_Toc228614408" w:history="1">
             <w:r>
               <w:rPr>
                 <w:rStyle w:val="Hyperlink"/>
@@ -6288,7 +6353,21 @@
                 <w:rStyle w:val="Hyperlink"/>
                 <w:noProof/>
               </w:rPr>
-              <w:t>CONCLUSÃO</w:t>
+              <w:t xml:space="preserve">CONCLUSÕES </w:t>
+            </w:r>
+            <w:r>
+              <w:rPr>
+                <w:rStyle w:val="Hyperlink"/>
+                <w:noProof/>
+              </w:rPr>
+              <w:t>E</w:t>
+            </w:r>
+            <w:r>
+              <w:rPr>
+                <w:rStyle w:val="Hyperlink"/>
+                <w:noProof/>
+              </w:rPr>
+              <w:t xml:space="preserve"> TRABALHOS FUTUROS</w:t>
             </w:r>
             <w:r>
               <w:rPr>
@@ -6309,7 +6388,7 @@
                 <w:noProof/>
                 <w:webHidden/>
               </w:rPr>
-              <w:instrText xml:space="preserve"> PAGEREF _Toc227939371 \h </w:instrText>
+              <w:instrText xml:space="preserve"> PAGEREF _Toc228614408 \h </w:instrText>
             </w:r>
             <w:r>
               <w:rPr>
@@ -6354,7 +6433,7 @@
               <w14:ligatures w14:val="standardContextual"/>
             </w:rPr>
           </w:pPr>
-          <w:hyperlink w:anchor="_Toc227939372" w:history="1">
+          <w:hyperlink w:anchor="_Toc228614409" w:history="1">
             <w:r>
               <w:rPr>
                 <w:rStyle w:val="Hyperlink"/>
@@ -6382,7 +6461,7 @@
                 <w:noProof/>
                 <w:webHidden/>
               </w:rPr>
-              <w:instrText xml:space="preserve"> PAGEREF _Toc227939372 \h </w:instrText>
+              <w:instrText xml:space="preserve"> PAGEREF _Toc228614409 \h </w:instrText>
             </w:r>
             <w:r>
               <w:rPr>
@@ -6438,7 +6517,7 @@
     </w:sdt>
     <w:bookmarkStart w:id="1" w:name="_Toc175231779"/>
     <w:bookmarkStart w:id="2" w:name="_Toc175908722"/>
-    <w:bookmarkStart w:id="3" w:name="_Toc227939346"/>
+    <w:bookmarkStart w:id="3" w:name="_Toc228614384"/>
     <w:p>
       <w:pPr>
         <w:pStyle w:val="Ttulo1"/>
@@ -6685,124 +6764,9 @@
           <w:iCs/>
           <w:lang w:eastAsia="pt-BR"/>
         </w:rPr>
-        <w:t>Design Thinking</w:t>
-      </w:r>
-      <w:r>
-        <w:rPr>
-          <w:lang w:eastAsia="pt-BR"/>
-        </w:rPr>
-        <w:t xml:space="preserve"> e</w:t>
-      </w:r>
-      <w:r>
-        <w:rPr>
-          <w:lang w:eastAsia="pt-BR"/>
-        </w:rPr>
-        <w:t>merge</w:t>
-      </w:r>
-      <w:r>
-        <w:rPr>
-          <w:lang w:eastAsia="pt-BR"/>
-        </w:rPr>
-        <w:t xml:space="preserve"> como uma abordagem </w:t>
-      </w:r>
-      <w:r>
-        <w:rPr>
-          <w:lang w:eastAsia="pt-BR"/>
-        </w:rPr>
-        <w:t>promissora e ef</w:t>
-      </w:r>
-      <w:r>
-        <w:rPr>
-          <w:lang w:eastAsia="pt-BR"/>
-        </w:rPr>
-        <w:t>icaz para a</w:t>
-      </w:r>
-      <w:r>
-        <w:rPr>
-          <w:lang w:eastAsia="pt-BR"/>
-        </w:rPr>
-        <w:t>uxiliar na</w:t>
-      </w:r>
-      <w:r>
-        <w:rPr>
-          <w:lang w:eastAsia="pt-BR"/>
-        </w:rPr>
-        <w:t xml:space="preserve"> criação de soluções centradas nas necessidades reais do</w:t>
-      </w:r>
-      <w:r>
-        <w:rPr>
-          <w:lang w:eastAsia="pt-BR"/>
-        </w:rPr>
-        <w:t>s</w:t>
-      </w:r>
-      <w:r>
-        <w:rPr>
-          <w:lang w:eastAsia="pt-BR"/>
-        </w:rPr>
-        <w:t xml:space="preserve"> </w:t>
-      </w:r>
-      <w:r>
-        <w:rPr>
-          <w:lang w:eastAsia="pt-BR"/>
-        </w:rPr>
-        <w:t>usuários</w:t>
-      </w:r>
-      <w:r>
-        <w:rPr>
-          <w:lang w:eastAsia="pt-BR"/>
-        </w:rPr>
-        <w:t>, p</w:t>
-      </w:r>
-      <w:r>
-        <w:rPr>
-          <w:lang w:eastAsia="pt-BR"/>
-        </w:rPr>
-        <w:t>ossibilitando</w:t>
-      </w:r>
-      <w:r>
-        <w:rPr>
-          <w:lang w:eastAsia="pt-BR"/>
-        </w:rPr>
-        <w:t xml:space="preserve"> o desenvolvimento de interfaces intuitivas e funcionais.</w:t>
-      </w:r>
-    </w:p>
-    <w:p>
-      <w:pPr>
-        <w:rPr>
-          <w:lang w:eastAsia="pt-BR"/>
-        </w:rPr>
-      </w:pPr>
-      <w:r>
-        <w:rPr>
-          <w:lang w:eastAsia="pt-BR"/>
-        </w:rPr>
-        <w:lastRenderedPageBreak/>
-        <w:tab/>
-      </w:r>
-      <w:r>
-        <w:rPr>
-          <w:lang w:eastAsia="pt-BR"/>
-        </w:rPr>
-        <w:t xml:space="preserve">Brown (2009) destaca que </w:t>
-      </w:r>
-      <w:r>
-        <w:rPr>
-          <w:lang w:eastAsia="pt-BR"/>
-        </w:rPr>
-        <w:t>a abordagem de</w:t>
-      </w:r>
-      <w:r>
-        <w:rPr>
-          <w:lang w:eastAsia="pt-BR"/>
-        </w:rPr>
-        <w:t xml:space="preserve"> </w:t>
-      </w:r>
-      <w:r>
-        <w:rPr>
-          <w:lang w:eastAsia="pt-BR"/>
-        </w:rPr>
-        <w:t>DT</w:t>
-      </w:r>
+        <w:t xml:space="preserve">Design </w:t>
+      </w:r>
+      <w:proofErr w:type="spellStart"/>
       <w:r>
         <w:rPr>
           <w:b/>
@@ -6811,323 +6775,124 @@
           <w:iCs/>
           <w:lang w:eastAsia="pt-BR"/>
         </w:rPr>
+        <w:t>Thinking</w:t>
+      </w:r>
+      <w:proofErr w:type="spellEnd"/>
+      <w:r>
+        <w:rPr>
+          <w:lang w:eastAsia="pt-BR"/>
+        </w:rPr>
+        <w:t xml:space="preserve"> e</w:t>
+      </w:r>
+      <w:r>
+        <w:rPr>
+          <w:lang w:eastAsia="pt-BR"/>
+        </w:rPr>
+        <w:t>merge</w:t>
+      </w:r>
+      <w:r>
+        <w:rPr>
+          <w:lang w:eastAsia="pt-BR"/>
+        </w:rPr>
+        <w:t xml:space="preserve"> como uma abordagem </w:t>
+      </w:r>
+      <w:r>
+        <w:rPr>
+          <w:lang w:eastAsia="pt-BR"/>
+        </w:rPr>
+        <w:t>promissora e ef</w:t>
+      </w:r>
+      <w:r>
+        <w:rPr>
+          <w:lang w:eastAsia="pt-BR"/>
+        </w:rPr>
+        <w:t>icaz para a</w:t>
+      </w:r>
+      <w:r>
+        <w:rPr>
+          <w:lang w:eastAsia="pt-BR"/>
+        </w:rPr>
+        <w:t>uxiliar na</w:t>
+      </w:r>
+      <w:r>
+        <w:rPr>
+          <w:lang w:eastAsia="pt-BR"/>
+        </w:rPr>
+        <w:t xml:space="preserve"> criação de soluções centradas nas necessidades reais do</w:t>
+      </w:r>
+      <w:r>
+        <w:rPr>
+          <w:lang w:eastAsia="pt-BR"/>
+        </w:rPr>
+        <w:t>s</w:t>
+      </w:r>
+      <w:r>
+        <w:rPr>
+          <w:lang w:eastAsia="pt-BR"/>
+        </w:rPr>
         <w:t xml:space="preserve"> </w:t>
       </w:r>
       <w:r>
         <w:rPr>
           <w:lang w:eastAsia="pt-BR"/>
         </w:rPr>
-        <w:t>permite compreender profundamente as necessidades dos usuários e criar produtos que realmente atendam às suas expectativas. Essa metodologia é especialmente útil no desenvolvimento de interfaces digitais, pois considera aspectos como usabilidade, acessibilidade e experiência do usuário.</w:t>
-      </w:r>
-    </w:p>
-    <w:p>
-      <w:pPr>
+        <w:t>usuários</w:t>
+      </w:r>
+      <w:r>
         <w:rPr>
           <w:lang w:eastAsia="pt-BR"/>
         </w:rPr>
-      </w:pPr>
+        <w:t>, p</w:t>
+      </w:r>
       <w:r>
         <w:rPr>
           <w:lang w:eastAsia="pt-BR"/>
         </w:rPr>
+        <w:t>ossibilitando</w:t>
+      </w:r>
+      <w:r>
+        <w:rPr>
+          <w:lang w:eastAsia="pt-BR"/>
+        </w:rPr>
+        <w:t xml:space="preserve"> o desenvolvimento de interfaces intuitivas e funcionais.</w:t>
+      </w:r>
+    </w:p>
+    <w:p>
+      <w:pPr>
+        <w:rPr>
+          <w:lang w:eastAsia="pt-BR"/>
+        </w:rPr>
+      </w:pPr>
+      <w:r>
+        <w:rPr>
+          <w:lang w:eastAsia="pt-BR"/>
+        </w:rPr>
+        <w:lastRenderedPageBreak/>
         <w:tab/>
       </w:r>
       <w:r>
         <w:rPr>
           <w:lang w:eastAsia="pt-BR"/>
         </w:rPr>
-        <w:t>Lima e Andrade (2021) reforçam a importância de considerar o perfil dos usuários na elaboração de sistemas institucionais. A personalização das funcionalidades e a adaptação às demandas específicas dos cursos ofertados são fatores que aumentam a eficácia e a aceitação das plataformas digitais</w:t>
+        <w:t xml:space="preserve">Brown (2009) destaca que </w:t>
       </w:r>
       <w:r>
         <w:rPr>
           <w:lang w:eastAsia="pt-BR"/>
         </w:rPr>
-        <w:tab/>
-      </w:r>
-    </w:p>
-    <w:p>
-      <w:pPr>
+        <w:t>a abordagem de</w:t>
+      </w:r>
+      <w:r>
         <w:rPr>
           <w:lang w:eastAsia="pt-BR"/>
         </w:rPr>
-      </w:pPr>
+        <w:t xml:space="preserve"> </w:t>
+      </w:r>
       <w:r>
         <w:rPr>
           <w:lang w:eastAsia="pt-BR"/>
         </w:rPr>
-        <w:tab/>
-        <w:t>Para atender o</w:t>
-      </w:r>
-      <w:r>
-        <w:rPr>
-          <w:lang w:eastAsia="pt-BR"/>
-        </w:rPr>
-        <w:t>s</w:t>
-      </w:r>
-      <w:r>
-        <w:rPr>
-          <w:lang w:eastAsia="pt-BR"/>
-        </w:rPr>
-        <w:t xml:space="preserve"> </w:t>
-      </w:r>
-      <w:r>
-        <w:rPr>
-          <w:lang w:eastAsia="pt-BR"/>
-        </w:rPr>
-        <w:t>requisitos</w:t>
-      </w:r>
-      <w:r>
-        <w:rPr>
-          <w:lang w:eastAsia="pt-BR"/>
-        </w:rPr>
-        <w:t xml:space="preserve"> </w:t>
-      </w:r>
-      <w:r>
-        <w:rPr>
-          <w:lang w:eastAsia="pt-BR"/>
-        </w:rPr>
-        <w:t xml:space="preserve">citados </w:t>
-      </w:r>
-      <w:r>
-        <w:rPr>
-          <w:lang w:eastAsia="pt-BR"/>
-        </w:rPr>
-        <w:t>acima</w:t>
-      </w:r>
-      <w:r>
-        <w:rPr>
-          <w:lang w:eastAsia="pt-BR"/>
-        </w:rPr>
-        <w:t xml:space="preserve">, </w:t>
-      </w:r>
-      <w:r>
-        <w:rPr>
-          <w:lang w:eastAsia="pt-BR"/>
-        </w:rPr>
-        <w:t xml:space="preserve">a proposta principal deste </w:t>
-      </w:r>
-      <w:r>
-        <w:rPr>
-          <w:lang w:eastAsia="pt-BR"/>
-        </w:rPr>
-        <w:t xml:space="preserve">trabalho </w:t>
-      </w:r>
-      <w:r>
-        <w:rPr>
-          <w:lang w:eastAsia="pt-BR"/>
-        </w:rPr>
-        <w:t>é</w:t>
-      </w:r>
-      <w:r>
-        <w:rPr>
-          <w:lang w:eastAsia="pt-BR"/>
-        </w:rPr>
-        <w:t xml:space="preserve"> </w:t>
-      </w:r>
-      <w:r>
-        <w:rPr>
-          <w:lang w:eastAsia="pt-BR"/>
-        </w:rPr>
-        <w:t xml:space="preserve">o </w:t>
-      </w:r>
-      <w:r>
-        <w:rPr>
-          <w:lang w:eastAsia="pt-BR"/>
-        </w:rPr>
-        <w:t xml:space="preserve">desenvolvimento de um protótipo de </w:t>
-      </w:r>
-      <w:r>
-        <w:rPr>
-          <w:lang w:eastAsia="pt-BR"/>
-        </w:rPr>
-        <w:t>plataforma</w:t>
-      </w:r>
-      <w:r>
-        <w:rPr>
-          <w:lang w:eastAsia="pt-BR"/>
-        </w:rPr>
-        <w:t xml:space="preserve"> voltad</w:t>
-      </w:r>
-      <w:r>
-        <w:rPr>
-          <w:lang w:eastAsia="pt-BR"/>
-        </w:rPr>
-        <w:t>a</w:t>
-      </w:r>
-      <w:r>
-        <w:rPr>
-          <w:lang w:eastAsia="pt-BR"/>
-        </w:rPr>
-        <w:t xml:space="preserve"> </w:t>
-      </w:r>
-      <w:r>
-        <w:rPr>
-          <w:lang w:eastAsia="pt-BR"/>
-        </w:rPr>
-        <w:t xml:space="preserve">para </w:t>
-      </w:r>
-      <w:r>
-        <w:rPr>
-          <w:lang w:eastAsia="pt-BR"/>
-        </w:rPr>
-        <w:t>à centralização e divulgação de vagas de estágio, oferecendo funcionalidades como cadastro e visualização de oportunidades</w:t>
-      </w:r>
-      <w:r>
-        <w:rPr>
-          <w:lang w:eastAsia="pt-BR"/>
-        </w:rPr>
-        <w:t>,</w:t>
-      </w:r>
-      <w:r>
-        <w:rPr>
-          <w:lang w:eastAsia="pt-BR"/>
-        </w:rPr>
-        <w:t xml:space="preserve"> gerenciamento </w:t>
-      </w:r>
-      <w:r>
-        <w:rPr>
-          <w:lang w:eastAsia="pt-BR"/>
-        </w:rPr>
-        <w:t xml:space="preserve">de usuários, </w:t>
-      </w:r>
-      <w:proofErr w:type="gramStart"/>
-      <w:r>
-        <w:rPr>
-          <w:lang w:eastAsia="pt-BR"/>
-        </w:rPr>
-        <w:t>etc.</w:t>
-      </w:r>
-      <w:r>
-        <w:rPr>
-          <w:lang w:eastAsia="pt-BR"/>
-        </w:rPr>
-        <w:t>.</w:t>
-      </w:r>
-      <w:proofErr w:type="gramEnd"/>
-      <w:r>
-        <w:rPr>
-          <w:lang w:eastAsia="pt-BR"/>
-        </w:rPr>
-        <w:t xml:space="preserve"> A</w:t>
-      </w:r>
-      <w:r>
-        <w:rPr>
-          <w:lang w:eastAsia="pt-BR"/>
-        </w:rPr>
-        <w:t>lém disso, a</w:t>
-      </w:r>
-      <w:r>
-        <w:rPr>
-          <w:lang w:eastAsia="pt-BR"/>
-        </w:rPr>
-        <w:t xml:space="preserve"> proposta será elaborada considerando as especificidades dos cursos ofertados e o perfil dos alunos do IFNMG campus Arinos, </w:t>
-      </w:r>
-      <w:r>
-        <w:rPr>
-          <w:lang w:eastAsia="pt-BR"/>
-        </w:rPr>
-        <w:t xml:space="preserve">a fim de </w:t>
-      </w:r>
-      <w:r>
-        <w:rPr>
-          <w:lang w:eastAsia="pt-BR"/>
-        </w:rPr>
-        <w:t>atender às demandas reais da comunidade acadêmica.</w:t>
-      </w:r>
-    </w:p>
-    <w:p>
-      <w:pPr>
-        <w:rPr>
-          <w:lang w:eastAsia="pt-BR"/>
-        </w:rPr>
-      </w:pPr>
-    </w:p>
-    <w:p>
-      <w:pPr>
-        <w:pStyle w:val="Ttulo2"/>
-      </w:pPr>
-      <w:bookmarkStart w:id="12" w:name="_Toc175218595"/>
-      <w:bookmarkStart w:id="13" w:name="_Toc175231785"/>
-      <w:bookmarkStart w:id="14" w:name="_Toc175908723"/>
-      <w:bookmarkStart w:id="15" w:name="_Toc227939347"/>
-      <w:r>
-        <w:t>justificativa</w:t>
-      </w:r>
-      <w:bookmarkEnd w:id="12"/>
-      <w:bookmarkEnd w:id="13"/>
-      <w:bookmarkEnd w:id="14"/>
-      <w:bookmarkEnd w:id="15"/>
-    </w:p>
-    <w:p/>
-    <w:p>
-      <w:pPr>
-        <w:rPr>
-          <w:lang w:eastAsia="pt-BR"/>
-        </w:rPr>
-      </w:pPr>
-      <w:r>
-        <w:rPr>
-          <w:lang w:eastAsia="pt-BR"/>
-        </w:rPr>
-        <w:t>A falta de um canal oficial e centralizado para a divulgação de vagas de estágio no IFNMG – Campus Arinos compromete a eficiência da comunicação entre a instituição e os estudantes, dificultando o acesso a oportunidades atualizadas e relevantes para a formação profissional. Atualmente, as informações sobre estágios são divulgadas de forma dispersa, por meio de murais físicos ou mensagens informais, o que gera falta de organização, baixa visibilidade e possíveis perdas de oportunidades para os alunos.</w:t>
-      </w:r>
-    </w:p>
-    <w:p>
-      <w:pPr>
-        <w:rPr>
-          <w:rFonts w:ascii="Times New Roman" w:hAnsi="Times New Roman" w:cs="Times New Roman"/>
-          <w:lang w:eastAsia="pt-BR"/>
-        </w:rPr>
-      </w:pPr>
-      <w:r>
-        <w:rPr>
-          <w:lang w:eastAsia="pt-BR"/>
-        </w:rPr>
-        <w:tab/>
-      </w:r>
-      <w:r>
-        <w:rPr>
-          <w:lang w:eastAsia="pt-BR"/>
-        </w:rPr>
-        <w:t>Diante desta situação</w:t>
-      </w:r>
-      <w:r>
-        <w:rPr>
-          <w:lang w:eastAsia="pt-BR"/>
-        </w:rPr>
-        <w:t>,</w:t>
-      </w:r>
-      <w:r>
-        <w:rPr>
-          <w:lang w:eastAsia="pt-BR"/>
-        </w:rPr>
-        <w:t xml:space="preserve"> o desenvolvimento de uma solução tecnológica que centralize e organize a divulgação dessas vagas, promovendo maior eficiência, transparência e acessibilidade</w:t>
-      </w:r>
-      <w:r>
-        <w:rPr>
-          <w:lang w:eastAsia="pt-BR"/>
-        </w:rPr>
-        <w:t xml:space="preserve"> se faz necessário</w:t>
-      </w:r>
-      <w:r>
-        <w:rPr>
-          <w:lang w:eastAsia="pt-BR"/>
-        </w:rPr>
-        <w:t>. Estudos apontam que ferramentas digitais, quando desenvolvidas com foco na experiência do usuário, contribuem significativamente para a melhoria dos processos institucionais e para a integração entre setores acadêmicos e discentes (COSTA et al., 2020; LIMA; ANDRADE, 2021).</w:t>
-      </w:r>
-    </w:p>
-    <w:p>
-      <w:pPr>
-        <w:rPr>
-          <w:lang w:eastAsia="pt-BR"/>
-        </w:rPr>
-      </w:pPr>
-      <w:r>
-        <w:rPr>
-          <w:lang w:eastAsia="pt-BR"/>
-        </w:rPr>
-        <w:lastRenderedPageBreak/>
-        <w:t xml:space="preserve">Considerando esse cenário, </w:t>
+        <w:t>DT</w:t>
       </w:r>
       <w:r>
         <w:rPr>
@@ -7137,8 +6902,346 @@
           <w:iCs/>
           <w:lang w:eastAsia="pt-BR"/>
         </w:rPr>
-        <w:t>Design Thinking</w:t>
-      </w:r>
+        <w:t xml:space="preserve"> </w:t>
+      </w:r>
+      <w:r>
+        <w:rPr>
+          <w:lang w:eastAsia="pt-BR"/>
+        </w:rPr>
+        <w:t>permite compreender profundamente as necessidades dos usuários e criar produtos que realmente atendam às suas expectativas. Essa metodologia é especialmente útil no desenvolvimento de interfaces digitais, pois considera aspectos como usabilidade, acessibilidade e experiência do usuário.</w:t>
+      </w:r>
+    </w:p>
+    <w:p>
+      <w:pPr>
+        <w:rPr>
+          <w:lang w:eastAsia="pt-BR"/>
+        </w:rPr>
+      </w:pPr>
+      <w:r>
+        <w:rPr>
+          <w:lang w:eastAsia="pt-BR"/>
+        </w:rPr>
+        <w:tab/>
+      </w:r>
+      <w:r>
+        <w:rPr>
+          <w:lang w:eastAsia="pt-BR"/>
+        </w:rPr>
+        <w:t>Lima e Andrade (2021) reforçam a importância de considerar o perfil dos usuários na elaboração de sistemas institucionais. A personalização das funcionalidades e a adaptação às demandas específicas dos cursos ofertados são fatores que aumentam a eficácia e a aceitação das plataformas digitais</w:t>
+      </w:r>
+      <w:r>
+        <w:rPr>
+          <w:lang w:eastAsia="pt-BR"/>
+        </w:rPr>
+        <w:tab/>
+      </w:r>
+    </w:p>
+    <w:p>
+      <w:pPr>
+        <w:rPr>
+          <w:lang w:eastAsia="pt-BR"/>
+        </w:rPr>
+      </w:pPr>
+      <w:r>
+        <w:rPr>
+          <w:lang w:eastAsia="pt-BR"/>
+        </w:rPr>
+        <w:tab/>
+        <w:t>Para atender o</w:t>
+      </w:r>
+      <w:r>
+        <w:rPr>
+          <w:lang w:eastAsia="pt-BR"/>
+        </w:rPr>
+        <w:t>s</w:t>
+      </w:r>
+      <w:r>
+        <w:rPr>
+          <w:lang w:eastAsia="pt-BR"/>
+        </w:rPr>
+        <w:t xml:space="preserve"> </w:t>
+      </w:r>
+      <w:r>
+        <w:rPr>
+          <w:lang w:eastAsia="pt-BR"/>
+        </w:rPr>
+        <w:t>requisitos</w:t>
+      </w:r>
+      <w:r>
+        <w:rPr>
+          <w:lang w:eastAsia="pt-BR"/>
+        </w:rPr>
+        <w:t xml:space="preserve"> </w:t>
+      </w:r>
+      <w:r>
+        <w:rPr>
+          <w:lang w:eastAsia="pt-BR"/>
+        </w:rPr>
+        <w:t xml:space="preserve">citados </w:t>
+      </w:r>
+      <w:r>
+        <w:rPr>
+          <w:lang w:eastAsia="pt-BR"/>
+        </w:rPr>
+        <w:t>acima</w:t>
+      </w:r>
+      <w:r>
+        <w:rPr>
+          <w:lang w:eastAsia="pt-BR"/>
+        </w:rPr>
+        <w:t xml:space="preserve">, </w:t>
+      </w:r>
+      <w:r>
+        <w:rPr>
+          <w:lang w:eastAsia="pt-BR"/>
+        </w:rPr>
+        <w:t xml:space="preserve">a proposta principal deste </w:t>
+      </w:r>
+      <w:r>
+        <w:rPr>
+          <w:lang w:eastAsia="pt-BR"/>
+        </w:rPr>
+        <w:t xml:space="preserve">trabalho </w:t>
+      </w:r>
+      <w:r>
+        <w:rPr>
+          <w:lang w:eastAsia="pt-BR"/>
+        </w:rPr>
+        <w:t>é</w:t>
+      </w:r>
+      <w:r>
+        <w:rPr>
+          <w:lang w:eastAsia="pt-BR"/>
+        </w:rPr>
+        <w:t xml:space="preserve"> </w:t>
+      </w:r>
+      <w:r>
+        <w:rPr>
+          <w:lang w:eastAsia="pt-BR"/>
+        </w:rPr>
+        <w:t xml:space="preserve">o </w:t>
+      </w:r>
+      <w:r>
+        <w:rPr>
+          <w:lang w:eastAsia="pt-BR"/>
+        </w:rPr>
+        <w:t xml:space="preserve">desenvolvimento de um protótipo de </w:t>
+      </w:r>
+      <w:r>
+        <w:rPr>
+          <w:lang w:eastAsia="pt-BR"/>
+        </w:rPr>
+        <w:t>plataforma</w:t>
+      </w:r>
+      <w:r>
+        <w:rPr>
+          <w:lang w:eastAsia="pt-BR"/>
+        </w:rPr>
+        <w:t xml:space="preserve"> voltad</w:t>
+      </w:r>
+      <w:r>
+        <w:rPr>
+          <w:lang w:eastAsia="pt-BR"/>
+        </w:rPr>
+        <w:t>a</w:t>
+      </w:r>
+      <w:r>
+        <w:rPr>
+          <w:lang w:eastAsia="pt-BR"/>
+        </w:rPr>
+        <w:t xml:space="preserve"> </w:t>
+      </w:r>
+      <w:r>
+        <w:rPr>
+          <w:lang w:eastAsia="pt-BR"/>
+        </w:rPr>
+        <w:t xml:space="preserve">para </w:t>
+      </w:r>
+      <w:r>
+        <w:rPr>
+          <w:lang w:eastAsia="pt-BR"/>
+        </w:rPr>
+        <w:t>à centralização e divulgação de vagas de estágio, oferecendo funcionalidades como cadastro e visualização de oportunidades</w:t>
+      </w:r>
+      <w:r>
+        <w:rPr>
+          <w:lang w:eastAsia="pt-BR"/>
+        </w:rPr>
+        <w:t>,</w:t>
+      </w:r>
+      <w:r>
+        <w:rPr>
+          <w:lang w:eastAsia="pt-BR"/>
+        </w:rPr>
+        <w:t xml:space="preserve"> gerenciamento </w:t>
+      </w:r>
+      <w:r>
+        <w:rPr>
+          <w:lang w:eastAsia="pt-BR"/>
+        </w:rPr>
+        <w:t xml:space="preserve">de usuários, </w:t>
+      </w:r>
+      <w:proofErr w:type="gramStart"/>
+      <w:r>
+        <w:rPr>
+          <w:lang w:eastAsia="pt-BR"/>
+        </w:rPr>
+        <w:t>etc.</w:t>
+      </w:r>
+      <w:r>
+        <w:rPr>
+          <w:lang w:eastAsia="pt-BR"/>
+        </w:rPr>
+        <w:t>.</w:t>
+      </w:r>
+      <w:proofErr w:type="gramEnd"/>
+      <w:r>
+        <w:rPr>
+          <w:lang w:eastAsia="pt-BR"/>
+        </w:rPr>
+        <w:t xml:space="preserve"> A</w:t>
+      </w:r>
+      <w:r>
+        <w:rPr>
+          <w:lang w:eastAsia="pt-BR"/>
+        </w:rPr>
+        <w:t>lém disso, a</w:t>
+      </w:r>
+      <w:r>
+        <w:rPr>
+          <w:lang w:eastAsia="pt-BR"/>
+        </w:rPr>
+        <w:t xml:space="preserve"> proposta será elaborada considerando as especificidades dos cursos ofertados e o perfil dos alunos do IFNMG campus Arinos, </w:t>
+      </w:r>
+      <w:r>
+        <w:rPr>
+          <w:lang w:eastAsia="pt-BR"/>
+        </w:rPr>
+        <w:t xml:space="preserve">a fim de </w:t>
+      </w:r>
+      <w:r>
+        <w:rPr>
+          <w:lang w:eastAsia="pt-BR"/>
+        </w:rPr>
+        <w:t>atender às demandas reais da comunidade acadêmica.</w:t>
+      </w:r>
+    </w:p>
+    <w:p>
+      <w:pPr>
+        <w:rPr>
+          <w:lang w:eastAsia="pt-BR"/>
+        </w:rPr>
+      </w:pPr>
+    </w:p>
+    <w:p>
+      <w:pPr>
+        <w:pStyle w:val="Ttulo2"/>
+      </w:pPr>
+      <w:bookmarkStart w:id="12" w:name="_Toc175218595"/>
+      <w:bookmarkStart w:id="13" w:name="_Toc175231785"/>
+      <w:bookmarkStart w:id="14" w:name="_Toc175908723"/>
+      <w:bookmarkStart w:id="15" w:name="_Toc228614385"/>
+      <w:r>
+        <w:t>justificativa</w:t>
+      </w:r>
+      <w:bookmarkEnd w:id="12"/>
+      <w:bookmarkEnd w:id="13"/>
+      <w:bookmarkEnd w:id="14"/>
+      <w:bookmarkEnd w:id="15"/>
+    </w:p>
+    <w:p/>
+    <w:p>
+      <w:pPr>
+        <w:rPr>
+          <w:lang w:eastAsia="pt-BR"/>
+        </w:rPr>
+      </w:pPr>
+      <w:r>
+        <w:rPr>
+          <w:lang w:eastAsia="pt-BR"/>
+        </w:rPr>
+        <w:t>A falta de um canal oficial e centralizado para a divulgação de vagas de estágio no IFNMG – Campus Arinos compromete a eficiência da comunicação entre a instituição e os estudantes, dificultando o acesso a oportunidades atualizadas e relevantes para a formação profissional. Atualmente, as informações sobre estágios são divulgadas de forma dispersa, por meio de murais físicos ou mensagens informais, o que gera falta de organização, baixa visibilidade e possíveis perdas de oportunidades para os alunos.</w:t>
+      </w:r>
+    </w:p>
+    <w:p>
+      <w:pPr>
+        <w:rPr>
+          <w:rFonts w:ascii="Times New Roman" w:hAnsi="Times New Roman" w:cs="Times New Roman"/>
+          <w:lang w:eastAsia="pt-BR"/>
+        </w:rPr>
+      </w:pPr>
+      <w:r>
+        <w:rPr>
+          <w:lang w:eastAsia="pt-BR"/>
+        </w:rPr>
+        <w:tab/>
+      </w:r>
+      <w:r>
+        <w:rPr>
+          <w:lang w:eastAsia="pt-BR"/>
+        </w:rPr>
+        <w:t>Diante desta situação</w:t>
+      </w:r>
+      <w:r>
+        <w:rPr>
+          <w:lang w:eastAsia="pt-BR"/>
+        </w:rPr>
+        <w:t>,</w:t>
+      </w:r>
+      <w:r>
+        <w:rPr>
+          <w:lang w:eastAsia="pt-BR"/>
+        </w:rPr>
+        <w:t xml:space="preserve"> o desenvolvimento de uma solução tecnológica que centralize e organize a divulgação dessas vagas, promovendo maior eficiência, transparência e acessibilidade</w:t>
+      </w:r>
+      <w:r>
+        <w:rPr>
+          <w:lang w:eastAsia="pt-BR"/>
+        </w:rPr>
+        <w:t xml:space="preserve"> se faz necessário</w:t>
+      </w:r>
+      <w:r>
+        <w:rPr>
+          <w:lang w:eastAsia="pt-BR"/>
+        </w:rPr>
+        <w:t>. Estudos apontam que ferramentas digitais, quando desenvolvidas com foco na experiência do usuário, contribuem significativamente para a melhoria dos processos institucionais e para a integração entre setores acadêmicos e discentes (COSTA et al., 2020; LIMA; ANDRADE, 2021).</w:t>
+      </w:r>
+    </w:p>
+    <w:p>
+      <w:pPr>
+        <w:rPr>
+          <w:lang w:eastAsia="pt-BR"/>
+        </w:rPr>
+      </w:pPr>
+      <w:r>
+        <w:rPr>
+          <w:lang w:eastAsia="pt-BR"/>
+        </w:rPr>
+        <w:lastRenderedPageBreak/>
+        <w:t xml:space="preserve">Considerando esse cenário, </w:t>
+      </w:r>
+      <w:r>
+        <w:rPr>
+          <w:b/>
+          <w:bCs/>
+          <w:i/>
+          <w:iCs/>
+          <w:lang w:eastAsia="pt-BR"/>
+        </w:rPr>
+        <w:t xml:space="preserve">Design </w:t>
+      </w:r>
+      <w:proofErr w:type="spellStart"/>
+      <w:r>
+        <w:rPr>
+          <w:b/>
+          <w:bCs/>
+          <w:i/>
+          <w:iCs/>
+          <w:lang w:eastAsia="pt-BR"/>
+        </w:rPr>
+        <w:t>Thinking</w:t>
+      </w:r>
+      <w:proofErr w:type="spellEnd"/>
       <w:r>
         <w:rPr>
           <w:lang w:eastAsia="pt-BR"/>
@@ -7372,7 +7475,7 @@
       <w:bookmarkStart w:id="16" w:name="_Toc175218596"/>
       <w:bookmarkStart w:id="17" w:name="_Toc175231786"/>
       <w:bookmarkStart w:id="18" w:name="_Toc175908724"/>
-      <w:bookmarkStart w:id="19" w:name="_Toc227939348"/>
+      <w:bookmarkStart w:id="19" w:name="_Toc228614386"/>
       <w:r>
         <w:t>OBJETIVOS</w:t>
       </w:r>
@@ -7425,7 +7528,15 @@
         <w:t xml:space="preserve">apenas </w:t>
       </w:r>
       <w:r>
-        <w:t xml:space="preserve">front-end) para </w:t>
+        <w:t>front-</w:t>
+      </w:r>
+      <w:proofErr w:type="spellStart"/>
+      <w:r>
+        <w:t>end</w:t>
+      </w:r>
+      <w:proofErr w:type="spellEnd"/>
+      <w:r>
+        <w:t xml:space="preserve">) para </w:t>
       </w:r>
       <w:r>
         <w:t xml:space="preserve">busca e </w:t>
@@ -7489,17 +7600,9 @@
           <w:i/>
           <w:iCs/>
         </w:rPr>
-        <w:t>Design Thinking</w:t>
-      </w:r>
-      <w:r>
-        <w:t xml:space="preserve"> </w:t>
-      </w:r>
-      <w:r>
-        <w:t xml:space="preserve">(DT) </w:t>
-      </w:r>
-      <w:r>
-        <w:t xml:space="preserve">ao framework </w:t>
-      </w:r>
+        <w:t xml:space="preserve">Design </w:t>
+      </w:r>
+      <w:proofErr w:type="spellStart"/>
       <w:r>
         <w:rPr>
           <w:b/>
@@ -7507,8 +7610,49 @@
           <w:i/>
           <w:iCs/>
         </w:rPr>
-        <w:t>Unified Process</w:t>
-      </w:r>
+        <w:t>Thinking</w:t>
+      </w:r>
+      <w:proofErr w:type="spellEnd"/>
+      <w:r>
+        <w:t xml:space="preserve"> </w:t>
+      </w:r>
+      <w:r>
+        <w:t xml:space="preserve">(DT) </w:t>
+      </w:r>
+      <w:r>
+        <w:t xml:space="preserve">ao framework </w:t>
+      </w:r>
+      <w:proofErr w:type="spellStart"/>
+      <w:r>
+        <w:rPr>
+          <w:b/>
+          <w:bCs/>
+          <w:i/>
+          <w:iCs/>
+        </w:rPr>
+        <w:t>Unified</w:t>
+      </w:r>
+      <w:proofErr w:type="spellEnd"/>
+      <w:r>
+        <w:rPr>
+          <w:b/>
+          <w:bCs/>
+          <w:i/>
+          <w:iCs/>
+        </w:rPr>
+        <w:t xml:space="preserve"> </w:t>
+      </w:r>
+      <w:proofErr w:type="spellStart"/>
+      <w:r>
+        <w:rPr>
+          <w:b/>
+          <w:bCs/>
+          <w:i/>
+          <w:iCs/>
+        </w:rPr>
+        <w:t>Process</w:t>
+      </w:r>
+      <w:proofErr w:type="spellEnd"/>
       <w:r>
         <w:t xml:space="preserve"> </w:t>
       </w:r>
@@ -7603,7 +7747,15 @@
         <w:t xml:space="preserve">funcionais </w:t>
       </w:r>
       <w:r>
-        <w:t>do front-end da plataforma a partir d</w:t>
+        <w:t>do front-</w:t>
+      </w:r>
+      <w:proofErr w:type="spellStart"/>
+      <w:r>
+        <w:t>end</w:t>
+      </w:r>
+      <w:proofErr w:type="spellEnd"/>
+      <w:r>
+        <w:t xml:space="preserve"> da plataforma a partir d</w:t>
       </w:r>
       <w:r>
         <w:t>a especificação d</w:t>
@@ -7622,7 +7774,15 @@
       </w:pPr>
       <w:r>
         <w:lastRenderedPageBreak/>
-        <w:t xml:space="preserve">Validar a plataforma (protótipo do front-end) </w:t>
+        <w:t>Validar a plataforma (protótipo do front-</w:t>
+      </w:r>
+      <w:proofErr w:type="spellStart"/>
+      <w:r>
+        <w:t>end</w:t>
+      </w:r>
+      <w:proofErr w:type="spellEnd"/>
+      <w:r>
+        <w:t xml:space="preserve">) </w:t>
       </w:r>
       <w:r>
         <w:t>de acordo com as</w:t>
@@ -7734,7 +7894,7 @@
       <w:bookmarkStart w:id="20" w:name="_Toc175218597"/>
       <w:bookmarkStart w:id="21" w:name="_Toc175231787"/>
       <w:bookmarkStart w:id="22" w:name="_Toc175908725"/>
-      <w:bookmarkStart w:id="23" w:name="_Toc227939349"/>
+      <w:bookmarkStart w:id="23" w:name="_Toc228614387"/>
       <w:r>
         <w:lastRenderedPageBreak/>
         <w:t>REFERENCIAL TEÓRICO</w:t>
@@ -7762,7 +7922,7 @@
       <w:pPr>
         <w:pStyle w:val="Ttulo2"/>
       </w:pPr>
-      <w:bookmarkStart w:id="37" w:name="_Toc227939350"/>
+      <w:bookmarkStart w:id="37" w:name="_Toc228614388"/>
       <w:r>
         <w:t>Design Thinking</w:t>
       </w:r>
@@ -7786,8 +7946,19 @@
           <w:i/>
           <w:iCs/>
         </w:rPr>
-        <w:t>Design Thinking</w:t>
-      </w:r>
+        <w:t xml:space="preserve">Design </w:t>
+      </w:r>
+      <w:proofErr w:type="spellStart"/>
+      <w:r>
+        <w:rPr>
+          <w:b/>
+          <w:bCs/>
+          <w:i/>
+          <w:iCs/>
+        </w:rPr>
+        <w:t>Thinking</w:t>
+      </w:r>
+      <w:proofErr w:type="spellEnd"/>
       <w:r>
         <w:t xml:space="preserve"> é um método focado na criatividade para resolução de problemas complexos, priorizando as necessidades reais do ser humano. Como abordagem valoriza a interação e a colaboração como base na empatia fundamental. </w:t>
       </w:r>
@@ -8080,19 +8251,35 @@
         <w:rPr>
           <w:rStyle w:val="Forte"/>
         </w:rPr>
-        <w:t>Design Thinking</w:t>
-      </w:r>
-    </w:p>
-    <w:p>
-      <w:pPr>
+        <w:t xml:space="preserve">Design </w:t>
+      </w:r>
+      <w:proofErr w:type="spellStart"/>
+      <w:r>
         <w:rPr>
           <w:rStyle w:val="Forte"/>
         </w:rPr>
-      </w:pPr>
-    </w:p>
-    <w:p>
-      <w:r>
-        <w:t xml:space="preserve">Design Thinking </w:t>
+        <w:t>Thinking</w:t>
+      </w:r>
+      <w:proofErr w:type="spellEnd"/>
+    </w:p>
+    <w:p>
+      <w:pPr>
+        <w:rPr>
+          <w:rStyle w:val="Forte"/>
+        </w:rPr>
+      </w:pPr>
+    </w:p>
+    <w:p>
+      <w:r>
+        <w:t xml:space="preserve">Design </w:t>
+      </w:r>
+      <w:proofErr w:type="spellStart"/>
+      <w:r>
+        <w:t>Thinking</w:t>
+      </w:r>
+      <w:proofErr w:type="spellEnd"/>
+      <w:r>
+        <w:t xml:space="preserve"> </w:t>
       </w:r>
       <w:r>
         <w:t xml:space="preserve">é um processo organizado, mas não sequenciado, em </w:t>
@@ -8272,7 +8459,7 @@
       <w:pPr>
         <w:pStyle w:val="Ttulo2"/>
       </w:pPr>
-      <w:bookmarkStart w:id="38" w:name="_Toc227939351"/>
+      <w:bookmarkStart w:id="38" w:name="_Toc228614389"/>
       <w:r>
         <w:t>Design UI UX</w:t>
       </w:r>
@@ -8468,7 +8655,7 @@
       <w:pPr>
         <w:pStyle w:val="Ttulo2"/>
       </w:pPr>
-      <w:bookmarkStart w:id="39" w:name="_Toc227939352"/>
+      <w:bookmarkStart w:id="39" w:name="_Toc228614390"/>
       <w:r>
         <w:t xml:space="preserve">processo de software e o </w:t>
       </w:r>
@@ -8810,7 +8997,15 @@
         <w:tab/>
       </w:r>
       <w:r>
-        <w:t>Segundo Kruchten (2004), o P</w:t>
+        <w:t xml:space="preserve">Segundo </w:t>
+      </w:r>
+      <w:proofErr w:type="spellStart"/>
+      <w:r>
+        <w:t>Kruchten</w:t>
+      </w:r>
+      <w:proofErr w:type="spellEnd"/>
+      <w:r>
+        <w:t xml:space="preserve"> (2004), o P</w:t>
       </w:r>
       <w:r>
         <w:t>U</w:t>
@@ -8959,7 +9154,7 @@
         <w:pStyle w:val="Ttulo2"/>
       </w:pPr>
       <w:bookmarkStart w:id="40" w:name="_jd3d4s30kzvs" w:colFirst="0" w:colLast="0"/>
-      <w:bookmarkStart w:id="41" w:name="_Toc227939353"/>
+      <w:bookmarkStart w:id="41" w:name="_Toc228614391"/>
       <w:bookmarkEnd w:id="40"/>
       <w:r>
         <w:lastRenderedPageBreak/>
@@ -9424,24 +9619,14 @@
         <w:lastRenderedPageBreak/>
         <w:t xml:space="preserve">Figura </w:t>
       </w:r>
-      <w:r>
-        <w:fldChar w:fldCharType="begin"/>
-      </w:r>
-      <w:r>
-        <w:instrText xml:space="preserve"> SEQ Figura \* ARABIC </w:instrText>
-      </w:r>
-      <w:r>
-        <w:fldChar w:fldCharType="separate"/>
-      </w:r>
-      <w:r>
-        <w:rPr>
-          <w:noProof/>
-        </w:rPr>
-        <w:t>1</w:t>
-      </w:r>
-      <w:r>
-        <w:fldChar w:fldCharType="end"/>
-      </w:r>
+      <w:fldSimple w:instr=" SEQ Figura \* ARABIC ">
+        <w:r>
+          <w:rPr>
+            <w:noProof/>
+          </w:rPr>
+          <w:t>1</w:t>
+        </w:r>
+      </w:fldSimple>
       <w:r>
         <w:t xml:space="preserve">: </w:t>
       </w:r>
@@ -9662,7 +9847,23 @@
         <w:t xml:space="preserve"> de mudanças</w:t>
       </w:r>
       <w:r>
-        <w:t xml:space="preserve"> (Espíndola, Majdenbaum &amp; Audy, 2011).</w:t>
+        <w:t xml:space="preserve"> (Espíndola, </w:t>
+      </w:r>
+      <w:proofErr w:type="spellStart"/>
+      <w:r>
+        <w:t>Majdenbaum</w:t>
+      </w:r>
+      <w:proofErr w:type="spellEnd"/>
+      <w:r>
+        <w:t xml:space="preserve"> &amp; </w:t>
+      </w:r>
+      <w:proofErr w:type="spellStart"/>
+      <w:r>
+        <w:t>Audy</w:t>
+      </w:r>
+      <w:proofErr w:type="spellEnd"/>
+      <w:r>
+        <w:t>, 2011).</w:t>
       </w:r>
     </w:p>
     <w:p>
@@ -9704,7 +9905,7 @@
         <w:pStyle w:val="Ttulo3"/>
       </w:pPr>
       <w:bookmarkStart w:id="43" w:name="_q8idu7nt7lr7" w:colFirst="0" w:colLast="0"/>
-      <w:bookmarkStart w:id="44" w:name="_Toc227939354"/>
+      <w:bookmarkStart w:id="44" w:name="_Toc228614392"/>
       <w:bookmarkEnd w:id="43"/>
       <w:r>
         <w:lastRenderedPageBreak/>
@@ -9794,24 +9995,14 @@
       <w:r>
         <w:t xml:space="preserve">Figura </w:t>
       </w:r>
-      <w:r>
-        <w:fldChar w:fldCharType="begin"/>
-      </w:r>
-      <w:r>
-        <w:instrText xml:space="preserve"> SEQ Figura \* ARABIC </w:instrText>
-      </w:r>
-      <w:r>
-        <w:fldChar w:fldCharType="separate"/>
-      </w:r>
-      <w:r>
-        <w:rPr>
-          <w:noProof/>
-        </w:rPr>
-        <w:t>2</w:t>
-      </w:r>
-      <w:r>
-        <w:fldChar w:fldCharType="end"/>
-      </w:r>
+      <w:fldSimple w:instr=" SEQ Figura \* ARABIC ">
+        <w:r>
+          <w:rPr>
+            <w:noProof/>
+          </w:rPr>
+          <w:t>2</w:t>
+        </w:r>
+      </w:fldSimple>
       <w:r>
         <w:t xml:space="preserve">: processo de </w:t>
       </w:r>
@@ -9907,7 +10098,7 @@
       </w:pPr>
       <w:bookmarkStart w:id="46" w:name="_w69741rzzqa7" w:colFirst="0" w:colLast="0"/>
       <w:bookmarkStart w:id="47" w:name="_iy6ohgihhx" w:colFirst="0" w:colLast="0"/>
-      <w:bookmarkStart w:id="48" w:name="_Toc227939355"/>
+      <w:bookmarkStart w:id="48" w:name="_Toc228614393"/>
       <w:bookmarkEnd w:id="46"/>
       <w:bookmarkEnd w:id="47"/>
       <w:r>
@@ -9984,7 +10175,15 @@
         <w:tab/>
       </w:r>
       <w:r>
-        <w:t>Segundo Melo e Bräscher (2014), requisitos funcionais podem ser entendidos como funções específicas que um sistema deve executar para satisfazer as necessidades dos usuários, estabelecendo tanto o que deve ser realizado quanto a forma como o sistema deve responder a diferentes entradas e eventos.</w:t>
+        <w:t xml:space="preserve">Segundo Melo e </w:t>
+      </w:r>
+      <w:proofErr w:type="spellStart"/>
+      <w:r>
+        <w:t>Bräscher</w:t>
+      </w:r>
+      <w:proofErr w:type="spellEnd"/>
+      <w:r>
+        <w:t xml:space="preserve"> (2014), requisitos funcionais podem ser entendidos como funções específicas que um sistema deve executar para satisfazer as necessidades dos usuários, estabelecendo tanto o que deve ser realizado quanto a forma como o sistema deve responder a diferentes entradas e eventos.</w:t>
       </w:r>
     </w:p>
     <w:p>
@@ -9997,7 +10196,7 @@
       <w:pPr>
         <w:pStyle w:val="Ttulo3"/>
       </w:pPr>
-      <w:bookmarkStart w:id="49" w:name="_Toc227939356"/>
+      <w:bookmarkStart w:id="49" w:name="_Toc228614394"/>
       <w:r>
         <w:t>Requisitos não funcionais</w:t>
       </w:r>
@@ -10040,7 +10239,7 @@
         <w:pStyle w:val="Ttulo2"/>
       </w:pPr>
       <w:bookmarkStart w:id="50" w:name="_eyfomf1iew8y" w:colFirst="0" w:colLast="0"/>
-      <w:bookmarkStart w:id="51" w:name="_Toc227939357"/>
+      <w:bookmarkStart w:id="51" w:name="_Toc228614395"/>
       <w:bookmarkEnd w:id="50"/>
       <w:r>
         <w:t>casos de uso</w:t>
@@ -10103,7 +10302,7 @@
         <w:pStyle w:val="Ttulo3"/>
       </w:pPr>
       <w:bookmarkStart w:id="53" w:name="_f8tv7r97tdhh" w:colFirst="0" w:colLast="0"/>
-      <w:bookmarkStart w:id="54" w:name="_Toc227939358"/>
+      <w:bookmarkStart w:id="54" w:name="_Toc228614396"/>
       <w:bookmarkEnd w:id="53"/>
       <w:r>
         <w:t>Diagramas de casos de uso</w:t>
@@ -10245,24 +10444,14 @@
       <w:r>
         <w:t xml:space="preserve">Figura </w:t>
       </w:r>
-      <w:r>
-        <w:fldChar w:fldCharType="begin"/>
-      </w:r>
-      <w:r>
-        <w:instrText xml:space="preserve"> SEQ Figura \* ARABIC </w:instrText>
-      </w:r>
-      <w:r>
-        <w:fldChar w:fldCharType="separate"/>
-      </w:r>
-      <w:r>
-        <w:rPr>
-          <w:noProof/>
-        </w:rPr>
-        <w:t>3</w:t>
-      </w:r>
-      <w:r>
-        <w:fldChar w:fldCharType="end"/>
-      </w:r>
+      <w:fldSimple w:instr=" SEQ Figura \* ARABIC ">
+        <w:r>
+          <w:rPr>
+            <w:noProof/>
+          </w:rPr>
+          <w:t>3</w:t>
+        </w:r>
+      </w:fldSimple>
       <w:r>
         <w:t>:</w:t>
       </w:r>
@@ -10388,8 +10577,13 @@
         <w:t xml:space="preserve">; </w:t>
       </w:r>
       <w:r>
-        <w:t>utilizando um template</w:t>
-      </w:r>
+        <w:t xml:space="preserve">utilizando um </w:t>
+      </w:r>
+      <w:proofErr w:type="spellStart"/>
+      <w:r>
+        <w:t>template</w:t>
+      </w:r>
+      <w:proofErr w:type="spellEnd"/>
       <w:r>
         <w:t>, como ilustrado pela Tabela 1</w:t>
       </w:r>
@@ -10402,6 +10596,7 @@
       <w:r>
         <w:t xml:space="preserve"> da UML (</w:t>
       </w:r>
+      <w:proofErr w:type="spellStart"/>
       <w:r>
         <w:rPr>
           <w:b/>
@@ -10409,8 +10604,49 @@
           <w:i/>
           <w:iCs/>
         </w:rPr>
-        <w:t>Unified Modeling Langague</w:t>
-      </w:r>
+        <w:t>Unified</w:t>
+      </w:r>
+      <w:proofErr w:type="spellEnd"/>
+      <w:r>
+        <w:rPr>
+          <w:b/>
+          <w:bCs/>
+          <w:i/>
+          <w:iCs/>
+        </w:rPr>
+        <w:t xml:space="preserve"> </w:t>
+      </w:r>
+      <w:proofErr w:type="spellStart"/>
+      <w:r>
+        <w:rPr>
+          <w:b/>
+          <w:bCs/>
+          <w:i/>
+          <w:iCs/>
+        </w:rPr>
+        <w:t>Modeling</w:t>
+      </w:r>
+      <w:proofErr w:type="spellEnd"/>
+      <w:r>
+        <w:rPr>
+          <w:b/>
+          <w:bCs/>
+          <w:i/>
+          <w:iCs/>
+        </w:rPr>
+        <w:t xml:space="preserve"> </w:t>
+      </w:r>
+      <w:proofErr w:type="spellStart"/>
+      <w:r>
+        <w:rPr>
+          <w:b/>
+          <w:bCs/>
+          <w:i/>
+          <w:iCs/>
+        </w:rPr>
+        <w:t>Langague</w:t>
+      </w:r>
+      <w:proofErr w:type="spellEnd"/>
       <w:r>
         <w:t>)</w:t>
       </w:r>
@@ -10445,27 +10681,14 @@
       <w:r>
         <w:t xml:space="preserve">Tabela </w:t>
       </w:r>
-      <w:r>
-        <w:fldChar w:fldCharType="begin"/>
-      </w:r>
-      <w:r>
-        <w:instrText xml:space="preserve"> SEQ Tabela \* ARABIC </w:instrText>
-      </w:r>
-      <w:r>
-        <w:fldChar w:fldCharType="separate"/>
-      </w:r>
-      <w:r>
-        <w:rPr>
-          <w:noProof/>
-        </w:rPr>
-        <w:t>1</w:t>
-      </w:r>
-      <w:r>
-        <w:rPr>
-          <w:noProof/>
-        </w:rPr>
-        <w:fldChar w:fldCharType="end"/>
-      </w:r>
+      <w:fldSimple w:instr=" SEQ Tabela \* ARABIC ">
+        <w:r>
+          <w:rPr>
+            <w:noProof/>
+          </w:rPr>
+          <w:t>1</w:t>
+        </w:r>
+      </w:fldSimple>
       <w:r>
         <w:t>: detalhamento de informações em casos de uso.</w:t>
       </w:r>
@@ -10537,7 +10760,7 @@
         <w:pStyle w:val="Ttulo2"/>
       </w:pPr>
       <w:bookmarkStart w:id="57" w:name="_1lsl0myurey5" w:colFirst="0" w:colLast="0"/>
-      <w:bookmarkStart w:id="58" w:name="_Toc227939359"/>
+      <w:bookmarkStart w:id="58" w:name="_Toc228614397"/>
       <w:bookmarkEnd w:id="57"/>
       <w:r>
         <w:lastRenderedPageBreak/>
@@ -10594,7 +10817,7 @@
       <w:pPr>
         <w:pStyle w:val="Ttulo3"/>
       </w:pPr>
-      <w:bookmarkStart w:id="59" w:name="_Toc227939360"/>
+      <w:bookmarkStart w:id="59" w:name="_Toc228614398"/>
       <w:r>
         <w:t>Tipos de estágio</w:t>
       </w:r>
@@ -10613,7 +10836,6 @@
           <w:ilvl w:val="0"/>
           <w:numId w:val="6"/>
         </w:numPr>
-        <w:jc w:val="both"/>
       </w:pPr>
       <w:r>
         <w:rPr>
@@ -10662,7 +10884,6 @@
           <w:ilvl w:val="0"/>
           <w:numId w:val="6"/>
         </w:numPr>
-        <w:jc w:val="both"/>
       </w:pPr>
       <w:bookmarkStart w:id="60" w:name="_irqp39wm42f2" w:colFirst="0" w:colLast="0"/>
       <w:bookmarkEnd w:id="60"/>
@@ -10789,7 +11010,6 @@
       <w:pPr>
         <w:pStyle w:val="PargrafodaLista"/>
         <w:ind w:left="1069"/>
-        <w:jc w:val="both"/>
       </w:pPr>
     </w:p>
     <w:p/>
@@ -10818,7 +11038,7 @@
       <w:pPr>
         <w:pStyle w:val="Ttulo1"/>
       </w:pPr>
-      <w:bookmarkStart w:id="64" w:name="_Toc227939361"/>
+      <w:bookmarkStart w:id="64" w:name="_Toc228614399"/>
       <w:r>
         <w:lastRenderedPageBreak/>
         <w:t>METODOLOGIA</w:t>
@@ -10839,8 +11059,9 @@
           <w:i/>
           <w:iCs/>
         </w:rPr>
-        <w:t>Design Thinking</w:t>
-      </w:r>
+        <w:t xml:space="preserve">Design </w:t>
+      </w:r>
+      <w:proofErr w:type="spellStart"/>
       <w:r>
         <w:rPr>
           <w:b/>
@@ -10848,20 +11069,9 @@
           <w:i/>
           <w:iCs/>
         </w:rPr>
-        <w:t xml:space="preserve"> </w:t>
-      </w:r>
-      <w:r>
-        <w:t>(DT)</w:t>
-      </w:r>
-      <w:r>
-        <w:t xml:space="preserve"> dentro do</w:t>
-      </w:r>
-      <w:r>
-        <w:t xml:space="preserve"> framework</w:t>
-      </w:r>
-      <w:r>
-        <w:t xml:space="preserve"> </w:t>
-      </w:r>
+        <w:t>Thinking</w:t>
+      </w:r>
+      <w:proofErr w:type="spellEnd"/>
       <w:r>
         <w:rPr>
           <w:b/>
@@ -10869,8 +11079,51 @@
           <w:i/>
           <w:iCs/>
         </w:rPr>
-        <w:t>Unified Process</w:t>
-      </w:r>
+        <w:t xml:space="preserve"> </w:t>
+      </w:r>
+      <w:r>
+        <w:t>(DT)</w:t>
+      </w:r>
+      <w:r>
+        <w:t xml:space="preserve"> dentro do</w:t>
+      </w:r>
+      <w:r>
+        <w:t xml:space="preserve"> framework</w:t>
+      </w:r>
+      <w:r>
+        <w:t xml:space="preserve"> </w:t>
+      </w:r>
+      <w:proofErr w:type="spellStart"/>
+      <w:r>
+        <w:rPr>
+          <w:b/>
+          <w:bCs/>
+          <w:i/>
+          <w:iCs/>
+        </w:rPr>
+        <w:t>Unified</w:t>
+      </w:r>
+      <w:proofErr w:type="spellEnd"/>
+      <w:r>
+        <w:rPr>
+          <w:b/>
+          <w:bCs/>
+          <w:i/>
+          <w:iCs/>
+        </w:rPr>
+        <w:t xml:space="preserve"> </w:t>
+      </w:r>
+      <w:proofErr w:type="spellStart"/>
+      <w:r>
+        <w:rPr>
+          <w:b/>
+          <w:bCs/>
+          <w:i/>
+          <w:iCs/>
+        </w:rPr>
+        <w:t>Process</w:t>
+      </w:r>
+      <w:proofErr w:type="spellEnd"/>
       <w:r>
         <w:t xml:space="preserve"> (UP), com vistas à</w:t>
       </w:r>
@@ -10940,7 +11193,7 @@
       <w:pPr>
         <w:pStyle w:val="Ttulo2"/>
       </w:pPr>
-      <w:bookmarkStart w:id="65" w:name="_Toc227939362"/>
+      <w:bookmarkStart w:id="65" w:name="_Toc228614400"/>
       <w:r>
         <w:t>FASES E DISCIPLINAS do PU</w:t>
       </w:r>
@@ -10988,24 +11241,14 @@
       <w:r>
         <w:t xml:space="preserve">Figura </w:t>
       </w:r>
-      <w:r>
-        <w:fldChar w:fldCharType="begin"/>
-      </w:r>
-      <w:r>
-        <w:instrText xml:space="preserve"> SEQ Figura \* ARABIC </w:instrText>
-      </w:r>
-      <w:r>
-        <w:fldChar w:fldCharType="separate"/>
-      </w:r>
-      <w:r>
-        <w:rPr>
-          <w:noProof/>
-        </w:rPr>
-        <w:t>4</w:t>
-      </w:r>
-      <w:r>
-        <w:fldChar w:fldCharType="end"/>
-      </w:r>
+      <w:fldSimple w:instr=" SEQ Figura \* ARABIC ">
+        <w:r>
+          <w:rPr>
+            <w:noProof/>
+          </w:rPr>
+          <w:t>4</w:t>
+        </w:r>
+      </w:fldSimple>
       <w:r>
         <w:t>: disciplinas e fases do PU</w:t>
       </w:r>
@@ -11337,7 +11580,6 @@
         <w:tabs>
           <w:tab w:val="clear" w:pos="709"/>
         </w:tabs>
-        <w:jc w:val="both"/>
       </w:pPr>
       <w:r>
         <w:rPr>
@@ -11360,7 +11602,6 @@
         <w:tabs>
           <w:tab w:val="clear" w:pos="709"/>
         </w:tabs>
-        <w:jc w:val="both"/>
       </w:pPr>
       <w:r>
         <w:rPr>
@@ -11407,7 +11648,6 @@
         <w:tabs>
           <w:tab w:val="clear" w:pos="709"/>
         </w:tabs>
-        <w:jc w:val="both"/>
       </w:pPr>
       <w:r>
         <w:rPr>
@@ -11429,8 +11669,19 @@
           <w:i/>
           <w:iCs/>
         </w:rPr>
-        <w:t>front-end</w:t>
-      </w:r>
+        <w:t>front-</w:t>
+      </w:r>
+      <w:proofErr w:type="spellStart"/>
+      <w:r>
+        <w:rPr>
+          <w:b/>
+          <w:bCs/>
+          <w:i/>
+          <w:iCs/>
+        </w:rPr>
+        <w:t>end</w:t>
+      </w:r>
+      <w:proofErr w:type="spellEnd"/>
       <w:r>
         <w:t>) usando alguma linguagem de programação e frameworks</w:t>
       </w:r>
@@ -11460,7 +11711,6 @@
         <w:tabs>
           <w:tab w:val="clear" w:pos="709"/>
         </w:tabs>
-        <w:jc w:val="both"/>
       </w:pPr>
       <w:r>
         <w:rPr>
@@ -11792,7 +12042,7 @@
       <w:pPr>
         <w:pStyle w:val="Ttulo2"/>
       </w:pPr>
-      <w:bookmarkStart w:id="67" w:name="_Toc227939363"/>
+      <w:bookmarkStart w:id="67" w:name="_Toc228614401"/>
       <w:r>
         <w:t>ARTEFATOS</w:t>
       </w:r>
@@ -12004,27 +12254,14 @@
       <w:r>
         <w:t xml:space="preserve">Tabela </w:t>
       </w:r>
-      <w:r>
-        <w:fldChar w:fldCharType="begin"/>
-      </w:r>
-      <w:r>
-        <w:instrText xml:space="preserve"> SEQ Tabela \* ARABIC </w:instrText>
-      </w:r>
-      <w:r>
-        <w:fldChar w:fldCharType="separate"/>
-      </w:r>
-      <w:r>
-        <w:rPr>
-          <w:noProof/>
-        </w:rPr>
-        <w:t>2</w:t>
-      </w:r>
-      <w:r>
-        <w:rPr>
-          <w:noProof/>
-        </w:rPr>
-        <w:fldChar w:fldCharType="end"/>
-      </w:r>
+      <w:fldSimple w:instr=" SEQ Tabela \* ARABIC ">
+        <w:r>
+          <w:rPr>
+            <w:noProof/>
+          </w:rPr>
+          <w:t>2</w:t>
+        </w:r>
+      </w:fldSimple>
       <w:r>
         <w:t>: artefatos produzidos e refinados em cada fase do PU.</w:t>
       </w:r>
@@ -12765,8 +13002,17 @@
                 <w:sz w:val="16"/>
                 <w:szCs w:val="16"/>
               </w:rPr>
-              <w:t>(figma</w:t>
-            </w:r>
+              <w:t>(</w:t>
+            </w:r>
+            <w:proofErr w:type="spellStart"/>
+            <w:r>
+              <w:rPr>
+                <w:sz w:val="16"/>
+                <w:szCs w:val="16"/>
+              </w:rPr>
+              <w:t>figma</w:t>
+            </w:r>
+            <w:proofErr w:type="spellEnd"/>
             <w:r>
               <w:rPr>
                 <w:sz w:val="16"/>
@@ -13397,10 +13643,10 @@
       <w:pPr>
         <w:pStyle w:val="Ttulo1"/>
       </w:pPr>
-      <w:bookmarkStart w:id="69" w:name="_Toc227939364"/>
-      <w:bookmarkStart w:id="70" w:name="_Toc175218599"/>
-      <w:bookmarkStart w:id="71" w:name="_Toc175231789"/>
-      <w:bookmarkStart w:id="72" w:name="_Toc175908734"/>
+      <w:bookmarkStart w:id="69" w:name="_Toc175218599"/>
+      <w:bookmarkStart w:id="70" w:name="_Toc175231789"/>
+      <w:bookmarkStart w:id="71" w:name="_Toc175908734"/>
+      <w:bookmarkStart w:id="72" w:name="_Toc228614402"/>
       <w:r>
         <w:lastRenderedPageBreak/>
         <w:t>RESULTADOS</w:t>
@@ -13408,11 +13654,17 @@
       <w:r>
         <w:t xml:space="preserve"> e analises</w:t>
       </w:r>
-      <w:bookmarkEnd w:id="69"/>
-    </w:p>
-    <w:p>
-      <w:r>
-        <w:t>Neste tópico, apresentarei a pesquisa de desenvolvimento e satisfação, realizada por meio de testes de usabilidade, análise de dados e as telas do protótipo.</w:t>
+      <w:bookmarkEnd w:id="72"/>
+    </w:p>
+    <w:p>
+      <w:r>
+        <w:t>Neste tópico, apresentare</w:t>
+      </w:r>
+      <w:r>
+        <w:t>mos</w:t>
+      </w:r>
+      <w:r>
+        <w:t xml:space="preserve"> a pesquisa de desenvolvimento e satisfação, realizada por meio de testes de usabilidade, análise de dados e telas do protótipo.</w:t>
       </w:r>
     </w:p>
     <w:p/>
@@ -13424,7 +13676,7 @@
       <w:r>
         <w:t xml:space="preserve"> </w:t>
       </w:r>
-      <w:bookmarkStart w:id="73" w:name="_Toc227939365"/>
+      <w:bookmarkStart w:id="73" w:name="_Toc228614403"/>
       <w:r>
         <w:t xml:space="preserve">PESQUISA PARA </w:t>
       </w:r>
@@ -13472,24 +13724,14 @@
       <w:r>
         <w:t xml:space="preserve">Figura </w:t>
       </w:r>
-      <w:r>
-        <w:fldChar w:fldCharType="begin"/>
-      </w:r>
-      <w:r>
-        <w:instrText xml:space="preserve"> SEQ Figura \* ARABIC </w:instrText>
-      </w:r>
-      <w:r>
-        <w:fldChar w:fldCharType="separate"/>
-      </w:r>
-      <w:r>
-        <w:rPr>
-          <w:noProof/>
-        </w:rPr>
-        <w:t>5</w:t>
-      </w:r>
-      <w:r>
-        <w:fldChar w:fldCharType="end"/>
-      </w:r>
+      <w:fldSimple w:instr=" SEQ Figura \* ARABIC ">
+        <w:r>
+          <w:rPr>
+            <w:noProof/>
+          </w:rPr>
+          <w:t>5</w:t>
+        </w:r>
+      </w:fldSimple>
       <w:r>
         <w:t xml:space="preserve">: </w:t>
       </w:r>
@@ -13582,24 +13824,14 @@
         <w:lastRenderedPageBreak/>
         <w:t xml:space="preserve">Figura </w:t>
       </w:r>
-      <w:r>
-        <w:fldChar w:fldCharType="begin"/>
-      </w:r>
-      <w:r>
-        <w:instrText xml:space="preserve"> SEQ Figura \* ARABIC </w:instrText>
-      </w:r>
-      <w:r>
-        <w:fldChar w:fldCharType="separate"/>
-      </w:r>
-      <w:r>
-        <w:rPr>
-          <w:noProof/>
-        </w:rPr>
-        <w:t>6</w:t>
-      </w:r>
-      <w:r>
-        <w:fldChar w:fldCharType="end"/>
-      </w:r>
+      <w:fldSimple w:instr=" SEQ Figura \* ARABIC ">
+        <w:r>
+          <w:rPr>
+            <w:noProof/>
+          </w:rPr>
+          <w:t>6</w:t>
+        </w:r>
+      </w:fldSimple>
       <w:r>
         <w:t xml:space="preserve">: </w:t>
       </w:r>
@@ -13745,24 +13977,14 @@
       <w:r>
         <w:t xml:space="preserve">Figura </w:t>
       </w:r>
-      <w:r>
-        <w:fldChar w:fldCharType="begin"/>
-      </w:r>
-      <w:r>
-        <w:instrText xml:space="preserve"> SEQ Figura \* ARABIC </w:instrText>
-      </w:r>
-      <w:r>
-        <w:fldChar w:fldCharType="separate"/>
-      </w:r>
-      <w:r>
-        <w:rPr>
-          <w:noProof/>
-        </w:rPr>
-        <w:t>7</w:t>
-      </w:r>
-      <w:r>
-        <w:fldChar w:fldCharType="end"/>
-      </w:r>
+      <w:fldSimple w:instr=" SEQ Figura \* ARABIC ">
+        <w:r>
+          <w:rPr>
+            <w:noProof/>
+          </w:rPr>
+          <w:t>7</w:t>
+        </w:r>
+      </w:fldSimple>
       <w:r>
         <w:t xml:space="preserve">: </w:t>
       </w:r>
@@ -13856,24 +14078,14 @@
         <w:lastRenderedPageBreak/>
         <w:t xml:space="preserve">Figura </w:t>
       </w:r>
-      <w:r>
-        <w:fldChar w:fldCharType="begin"/>
-      </w:r>
-      <w:r>
-        <w:instrText xml:space="preserve"> SEQ Figura \* ARABIC </w:instrText>
-      </w:r>
-      <w:r>
-        <w:fldChar w:fldCharType="separate"/>
-      </w:r>
-      <w:r>
-        <w:rPr>
-          <w:noProof/>
-        </w:rPr>
-        <w:t>8</w:t>
-      </w:r>
-      <w:r>
-        <w:fldChar w:fldCharType="end"/>
-      </w:r>
+      <w:fldSimple w:instr=" SEQ Figura \* ARABIC ">
+        <w:r>
+          <w:rPr>
+            <w:noProof/>
+          </w:rPr>
+          <w:t>8</w:t>
+        </w:r>
+      </w:fldSimple>
       <w:r>
         <w:t xml:space="preserve">: </w:t>
       </w:r>
@@ -13973,24 +14185,14 @@
       <w:r>
         <w:t xml:space="preserve">Figura </w:t>
       </w:r>
-      <w:r>
-        <w:fldChar w:fldCharType="begin"/>
-      </w:r>
-      <w:r>
-        <w:instrText xml:space="preserve"> SEQ Figura \* ARABIC </w:instrText>
-      </w:r>
-      <w:r>
-        <w:fldChar w:fldCharType="separate"/>
-      </w:r>
-      <w:r>
-        <w:rPr>
-          <w:noProof/>
-        </w:rPr>
-        <w:t>9</w:t>
-      </w:r>
-      <w:r>
-        <w:fldChar w:fldCharType="end"/>
-      </w:r>
+      <w:fldSimple w:instr=" SEQ Figura \* ARABIC ">
+        <w:r>
+          <w:rPr>
+            <w:noProof/>
+          </w:rPr>
+          <w:t>9</w:t>
+        </w:r>
+      </w:fldSimple>
       <w:r>
         <w:t xml:space="preserve">: </w:t>
       </w:r>
@@ -14114,24 +14316,14 @@
         <w:lastRenderedPageBreak/>
         <w:t xml:space="preserve">Figura </w:t>
       </w:r>
-      <w:r>
-        <w:fldChar w:fldCharType="begin"/>
-      </w:r>
-      <w:r>
-        <w:instrText xml:space="preserve"> SEQ Figura \* ARABIC </w:instrText>
-      </w:r>
-      <w:r>
-        <w:fldChar w:fldCharType="separate"/>
-      </w:r>
-      <w:r>
-        <w:rPr>
-          <w:noProof/>
-        </w:rPr>
-        <w:t>10</w:t>
-      </w:r>
-      <w:r>
-        <w:fldChar w:fldCharType="end"/>
-      </w:r>
+      <w:fldSimple w:instr=" SEQ Figura \* ARABIC ">
+        <w:r>
+          <w:rPr>
+            <w:noProof/>
+          </w:rPr>
+          <w:t>10</w:t>
+        </w:r>
+      </w:fldSimple>
       <w:r>
         <w:t xml:space="preserve">: </w:t>
       </w:r>
@@ -14225,24 +14417,14 @@
       <w:r>
         <w:t xml:space="preserve">Figura </w:t>
       </w:r>
-      <w:r>
-        <w:fldChar w:fldCharType="begin"/>
-      </w:r>
-      <w:r>
-        <w:instrText xml:space="preserve"> SEQ Figura \* ARABIC </w:instrText>
-      </w:r>
-      <w:r>
-        <w:fldChar w:fldCharType="separate"/>
-      </w:r>
-      <w:r>
-        <w:rPr>
-          <w:noProof/>
-        </w:rPr>
-        <w:t>11</w:t>
-      </w:r>
-      <w:r>
-        <w:fldChar w:fldCharType="end"/>
-      </w:r>
+      <w:fldSimple w:instr=" SEQ Figura \* ARABIC ">
+        <w:r>
+          <w:rPr>
+            <w:noProof/>
+          </w:rPr>
+          <w:t>11</w:t>
+        </w:r>
+      </w:fldSimple>
       <w:r>
         <w:t xml:space="preserve">: </w:t>
       </w:r>
@@ -14345,24 +14527,14 @@
         <w:lastRenderedPageBreak/>
         <w:t xml:space="preserve">Figura </w:t>
       </w:r>
-      <w:r>
-        <w:fldChar w:fldCharType="begin"/>
-      </w:r>
-      <w:r>
-        <w:instrText xml:space="preserve"> SEQ Figura \* ARABIC </w:instrText>
-      </w:r>
-      <w:r>
-        <w:fldChar w:fldCharType="separate"/>
-      </w:r>
-      <w:r>
-        <w:rPr>
-          <w:noProof/>
-        </w:rPr>
-        <w:t>12</w:t>
-      </w:r>
-      <w:r>
-        <w:fldChar w:fldCharType="end"/>
-      </w:r>
+      <w:fldSimple w:instr=" SEQ Figura \* ARABIC ">
+        <w:r>
+          <w:rPr>
+            <w:noProof/>
+          </w:rPr>
+          <w:t>12</w:t>
+        </w:r>
+      </w:fldSimple>
       <w:r>
         <w:t xml:space="preserve">: </w:t>
       </w:r>
@@ -14459,24 +14631,14 @@
       <w:r>
         <w:t xml:space="preserve">Figura </w:t>
       </w:r>
-      <w:r>
-        <w:fldChar w:fldCharType="begin"/>
-      </w:r>
-      <w:r>
-        <w:instrText xml:space="preserve"> SEQ Figura \* ARABIC </w:instrText>
-      </w:r>
-      <w:r>
-        <w:fldChar w:fldCharType="separate"/>
-      </w:r>
-      <w:r>
-        <w:rPr>
-          <w:noProof/>
-        </w:rPr>
-        <w:t>13</w:t>
-      </w:r>
-      <w:r>
-        <w:fldChar w:fldCharType="end"/>
-      </w:r>
+      <w:fldSimple w:instr=" SEQ Figura \* ARABIC ">
+        <w:r>
+          <w:rPr>
+            <w:noProof/>
+          </w:rPr>
+          <w:t>13</w:t>
+        </w:r>
+      </w:fldSimple>
       <w:r>
         <w:t xml:space="preserve">: </w:t>
       </w:r>
@@ -14576,24 +14738,14 @@
         <w:lastRenderedPageBreak/>
         <w:t xml:space="preserve">Figura </w:t>
       </w:r>
-      <w:r>
-        <w:fldChar w:fldCharType="begin"/>
-      </w:r>
-      <w:r>
-        <w:instrText xml:space="preserve"> SEQ Figura \* ARABIC </w:instrText>
-      </w:r>
-      <w:r>
-        <w:fldChar w:fldCharType="separate"/>
-      </w:r>
-      <w:r>
-        <w:rPr>
-          <w:noProof/>
-        </w:rPr>
-        <w:t>14</w:t>
-      </w:r>
-      <w:r>
-        <w:fldChar w:fldCharType="end"/>
-      </w:r>
+      <w:fldSimple w:instr=" SEQ Figura \* ARABIC ">
+        <w:r>
+          <w:rPr>
+            <w:noProof/>
+          </w:rPr>
+          <w:t>14</w:t>
+        </w:r>
+      </w:fldSimple>
       <w:r>
         <w:t xml:space="preserve">: </w:t>
       </w:r>
@@ -14701,7 +14853,7 @@
       <w:r>
         <w:t xml:space="preserve"> </w:t>
       </w:r>
-      <w:bookmarkStart w:id="84" w:name="_Toc227939366"/>
+      <w:bookmarkStart w:id="84" w:name="_Toc228614404"/>
       <w:r>
         <w:t>CASO DE USO DO PROTÓTIPO</w:t>
       </w:r>
@@ -14727,24 +14879,14 @@
       <w:r>
         <w:t xml:space="preserve">Figura </w:t>
       </w:r>
-      <w:r>
-        <w:fldChar w:fldCharType="begin"/>
-      </w:r>
-      <w:r>
-        <w:instrText xml:space="preserve"> SEQ Figura \* ARABIC </w:instrText>
-      </w:r>
-      <w:r>
-        <w:fldChar w:fldCharType="separate"/>
-      </w:r>
-      <w:r>
-        <w:rPr>
-          <w:noProof/>
-        </w:rPr>
-        <w:t>15</w:t>
-      </w:r>
-      <w:r>
-        <w:fldChar w:fldCharType="end"/>
-      </w:r>
+      <w:fldSimple w:instr=" SEQ Figura \* ARABIC ">
+        <w:r>
+          <w:rPr>
+            <w:noProof/>
+          </w:rPr>
+          <w:t>15</w:t>
+        </w:r>
+      </w:fldSimple>
       <w:r>
         <w:t xml:space="preserve">: </w:t>
       </w:r>
@@ -14803,7 +14945,7 @@
         <w:pStyle w:val="Ttulo2"/>
         <w:ind w:left="0" w:firstLine="0"/>
       </w:pPr>
-      <w:bookmarkStart w:id="86" w:name="_Toc227939367"/>
+      <w:bookmarkStart w:id="86" w:name="_Toc228614405"/>
       <w:r>
         <w:lastRenderedPageBreak/>
         <w:t>PROTÓTIPO</w:t>
@@ -14859,24 +15001,14 @@
       <w:r>
         <w:t xml:space="preserve">Figura </w:t>
       </w:r>
-      <w:r>
-        <w:fldChar w:fldCharType="begin"/>
-      </w:r>
-      <w:r>
-        <w:instrText xml:space="preserve"> SEQ Figura \* ARABIC </w:instrText>
-      </w:r>
-      <w:r>
-        <w:fldChar w:fldCharType="separate"/>
-      </w:r>
-      <w:r>
-        <w:rPr>
-          <w:noProof/>
-        </w:rPr>
-        <w:t>16</w:t>
-      </w:r>
-      <w:r>
-        <w:fldChar w:fldCharType="end"/>
-      </w:r>
+      <w:fldSimple w:instr=" SEQ Figura \* ARABIC ">
+        <w:r>
+          <w:rPr>
+            <w:noProof/>
+          </w:rPr>
+          <w:t>16</w:t>
+        </w:r>
+      </w:fldSimple>
       <w:r>
         <w:t xml:space="preserve">: </w:t>
       </w:r>
@@ -15026,24 +15158,14 @@
         <w:lastRenderedPageBreak/>
         <w:t xml:space="preserve">Figura </w:t>
       </w:r>
-      <w:r>
-        <w:fldChar w:fldCharType="begin"/>
-      </w:r>
-      <w:r>
-        <w:instrText xml:space="preserve"> SEQ Figura \* ARABIC </w:instrText>
-      </w:r>
-      <w:r>
-        <w:fldChar w:fldCharType="separate"/>
-      </w:r>
-      <w:r>
-        <w:rPr>
-          <w:noProof/>
-        </w:rPr>
-        <w:t>17</w:t>
-      </w:r>
-      <w:r>
-        <w:fldChar w:fldCharType="end"/>
-      </w:r>
+      <w:fldSimple w:instr=" SEQ Figura \* ARABIC ">
+        <w:r>
+          <w:rPr>
+            <w:noProof/>
+          </w:rPr>
+          <w:t>17</w:t>
+        </w:r>
+      </w:fldSimple>
       <w:r>
         <w:t xml:space="preserve">: </w:t>
       </w:r>
@@ -15209,24 +15331,14 @@
       <w:r>
         <w:t xml:space="preserve">Figura </w:t>
       </w:r>
-      <w:r>
-        <w:fldChar w:fldCharType="begin"/>
-      </w:r>
-      <w:r>
-        <w:instrText xml:space="preserve"> SEQ Figura \* ARABIC </w:instrText>
-      </w:r>
-      <w:r>
-        <w:fldChar w:fldCharType="separate"/>
-      </w:r>
-      <w:r>
-        <w:rPr>
-          <w:noProof/>
-        </w:rPr>
-        <w:t>18</w:t>
-      </w:r>
-      <w:r>
-        <w:fldChar w:fldCharType="end"/>
-      </w:r>
+      <w:fldSimple w:instr=" SEQ Figura \* ARABIC ">
+        <w:r>
+          <w:rPr>
+            <w:noProof/>
+          </w:rPr>
+          <w:t>18</w:t>
+        </w:r>
+      </w:fldSimple>
       <w:r>
         <w:t xml:space="preserve">: </w:t>
       </w:r>
@@ -15393,24 +15505,14 @@
         <w:lastRenderedPageBreak/>
         <w:t xml:space="preserve">Figura </w:t>
       </w:r>
-      <w:r>
-        <w:fldChar w:fldCharType="begin"/>
-      </w:r>
-      <w:r>
-        <w:instrText xml:space="preserve"> SEQ Figura \* ARABIC </w:instrText>
-      </w:r>
-      <w:r>
-        <w:fldChar w:fldCharType="separate"/>
-      </w:r>
-      <w:r>
-        <w:rPr>
-          <w:noProof/>
-        </w:rPr>
-        <w:t>19</w:t>
-      </w:r>
-      <w:r>
-        <w:fldChar w:fldCharType="end"/>
-      </w:r>
+      <w:fldSimple w:instr=" SEQ Figura \* ARABIC ">
+        <w:r>
+          <w:rPr>
+            <w:noProof/>
+          </w:rPr>
+          <w:t>19</w:t>
+        </w:r>
+      </w:fldSimple>
       <w:r>
         <w:t xml:space="preserve">: </w:t>
       </w:r>
@@ -15565,24 +15667,14 @@
       <w:r>
         <w:t xml:space="preserve">Figura </w:t>
       </w:r>
-      <w:r>
-        <w:fldChar w:fldCharType="begin"/>
-      </w:r>
-      <w:r>
-        <w:instrText xml:space="preserve"> SEQ Figura \* ARABIC </w:instrText>
-      </w:r>
-      <w:r>
-        <w:fldChar w:fldCharType="separate"/>
-      </w:r>
-      <w:r>
-        <w:rPr>
-          <w:noProof/>
-        </w:rPr>
-        <w:t>20</w:t>
-      </w:r>
-      <w:r>
-        <w:fldChar w:fldCharType="end"/>
-      </w:r>
+      <w:fldSimple w:instr=" SEQ Figura \* ARABIC ">
+        <w:r>
+          <w:rPr>
+            <w:noProof/>
+          </w:rPr>
+          <w:t>20</w:t>
+        </w:r>
+      </w:fldSimple>
       <w:r>
         <w:t xml:space="preserve">: </w:t>
       </w:r>
@@ -15724,24 +15816,14 @@
       <w:r>
         <w:t xml:space="preserve">Figura </w:t>
       </w:r>
-      <w:r>
-        <w:fldChar w:fldCharType="begin"/>
-      </w:r>
-      <w:r>
-        <w:instrText xml:space="preserve"> SEQ Figura \* ARABIC </w:instrText>
-      </w:r>
-      <w:r>
-        <w:fldChar w:fldCharType="separate"/>
-      </w:r>
-      <w:r>
-        <w:rPr>
-          <w:noProof/>
-        </w:rPr>
-        <w:t>21</w:t>
-      </w:r>
-      <w:r>
-        <w:fldChar w:fldCharType="end"/>
-      </w:r>
+      <w:fldSimple w:instr=" SEQ Figura \* ARABIC ">
+        <w:r>
+          <w:rPr>
+            <w:noProof/>
+          </w:rPr>
+          <w:t>21</w:t>
+        </w:r>
+      </w:fldSimple>
       <w:r>
         <w:t xml:space="preserve">: </w:t>
       </w:r>
@@ -15773,6 +15855,9 @@
       </w:pPr>
       <w:bookmarkStart w:id="97" w:name="_Toc227938830"/>
       <w:bookmarkStart w:id="98" w:name="_Toc227939369"/>
+      <w:bookmarkStart w:id="99" w:name="_Toc228613103"/>
+      <w:bookmarkStart w:id="100" w:name="_Toc228613584"/>
+      <w:bookmarkStart w:id="101" w:name="_Toc228614406"/>
       <w:r>
         <w:rPr>
           <w:rFonts w:ascii="Times New Roman" w:eastAsia="Calibri" w:hAnsi="Times New Roman" w:cs="Times New Roman"/>
@@ -15821,6 +15906,9 @@
       </w:r>
       <w:bookmarkEnd w:id="97"/>
       <w:bookmarkEnd w:id="98"/>
+      <w:bookmarkEnd w:id="99"/>
+      <w:bookmarkEnd w:id="100"/>
+      <w:bookmarkEnd w:id="101"/>
     </w:p>
     <w:p>
       <w:pPr>
@@ -15979,59 +16067,116 @@
         <w:pStyle w:val="Ttulo2"/>
         <w:ind w:left="0" w:firstLine="0"/>
       </w:pPr>
-      <w:bookmarkStart w:id="99" w:name="_Toc227939370"/>
-      <w:r>
-        <w:t>PESQUISA DE USABILIDADE E DE EXPERIÊNCIA DO USUÁRIO</w:t>
-      </w:r>
-      <w:bookmarkEnd w:id="99"/>
-    </w:p>
-    <w:p>
-      <w:r>
-        <w:t>A validação do protótipo ocorreu por meio de um questionário de nove perguntas aplicado a uma amostra de dez acadêmicos do IFNMG – Campus Arinos. A pesquisa visou avaliar a satisfação e experiência do Usuário.</w:t>
+      <w:bookmarkStart w:id="102" w:name="_Toc228614407"/>
+      <w:r>
+        <w:t>USABILIDADE E EXPERIÊNCIA DO USUÁRIO</w:t>
+      </w:r>
+      <w:bookmarkEnd w:id="102"/>
+    </w:p>
+    <w:p>
+      <w:r>
+        <w:t xml:space="preserve">Para </w:t>
+      </w:r>
+      <w:r>
+        <w:t>valid</w:t>
+      </w:r>
+      <w:r>
+        <w:t>ar</w:t>
+      </w:r>
+      <w:r>
+        <w:t xml:space="preserve"> o protótipo</w:t>
+      </w:r>
+      <w:r>
+        <w:t xml:space="preserve"> em relação a usabilidade e experiência do usuário,</w:t>
+      </w:r>
+      <w:r>
+        <w:t xml:space="preserve"> </w:t>
+      </w:r>
+      <w:r>
+        <w:t xml:space="preserve">foi realizada </w:t>
+      </w:r>
+      <w:r>
+        <w:t xml:space="preserve">uma pesquisa por meio de </w:t>
+      </w:r>
+      <w:r>
+        <w:t xml:space="preserve">um questionário </w:t>
+      </w:r>
+      <w:r>
+        <w:t xml:space="preserve">contendo </w:t>
+      </w:r>
+      <w:r>
+        <w:t>nove perguntas</w:t>
+      </w:r>
+      <w:r>
+        <w:t>.</w:t>
+      </w:r>
+      <w:r>
+        <w:t xml:space="preserve"> </w:t>
+      </w:r>
+      <w:r>
+        <w:t xml:space="preserve">Devido as dificuldades encontradas para </w:t>
+      </w:r>
+      <w:r>
+        <w:t xml:space="preserve">realizar a pesquisa, o questionário foi </w:t>
+      </w:r>
+      <w:r>
+        <w:t>aplicado a uma</w:t>
+      </w:r>
+      <w:r>
+        <w:t xml:space="preserve"> pequena</w:t>
+      </w:r>
+      <w:r>
+        <w:t xml:space="preserve"> amostra de dez acadêmicos do IFNMG – Campus Arinos. </w:t>
+      </w:r>
+      <w:r>
+        <w:t xml:space="preserve">O objetivo principal da </w:t>
+      </w:r>
+      <w:r>
+        <w:t xml:space="preserve">pesquisa </w:t>
+      </w:r>
+      <w:r>
+        <w:t>era</w:t>
+      </w:r>
+      <w:r>
+        <w:t xml:space="preserve"> avaliar a satisfação e experiência do Usuário</w:t>
+      </w:r>
+      <w:r>
+        <w:t xml:space="preserve"> em relação a finalidade do sistema, design da interface, modernidade, etc</w:t>
+      </w:r>
+      <w:r>
+        <w:t>.</w:t>
+      </w:r>
+      <w:r>
+        <w:t xml:space="preserve"> e obter um feedback com sugestões de melhoria. </w:t>
       </w:r>
     </w:p>
     <w:p/>
     <w:p/>
+    <w:p/>
     <w:p>
       <w:pPr>
         <w:pStyle w:val="Legenda"/>
         <w:keepNext/>
       </w:pPr>
-      <w:bookmarkStart w:id="100" w:name="_Toc227939335"/>
-    </w:p>
-    <w:p>
-      <w:pPr>
-        <w:pStyle w:val="Legenda"/>
-        <w:keepNext/>
-      </w:pPr>
+      <w:bookmarkStart w:id="103" w:name="_Toc227939335"/>
       <w:r>
         <w:t xml:space="preserve">Figura </w:t>
       </w:r>
-      <w:r>
-        <w:fldChar w:fldCharType="begin"/>
-      </w:r>
-      <w:r>
-        <w:instrText xml:space="preserve"> SEQ Figura \* ARABIC </w:instrText>
-      </w:r>
-      <w:r>
-        <w:fldChar w:fldCharType="separate"/>
-      </w:r>
-      <w:r>
-        <w:rPr>
-          <w:noProof/>
-        </w:rPr>
-        <w:t>22</w:t>
-      </w:r>
-      <w:r>
-        <w:fldChar w:fldCharType="end"/>
-      </w:r>
+      <w:fldSimple w:instr=" SEQ Figura \* ARABIC ">
+        <w:r>
+          <w:rPr>
+            <w:noProof/>
+          </w:rPr>
+          <w:t>22</w:t>
+        </w:r>
+      </w:fldSimple>
       <w:r>
         <w:t xml:space="preserve">: </w:t>
       </w:r>
       <w:r>
         <w:t>Finalidade do Sistema</w:t>
       </w:r>
-      <w:bookmarkEnd w:id="100"/>
+      <w:bookmarkEnd w:id="103"/>
     </w:p>
     <w:p/>
     <w:p>
@@ -16184,35 +16329,25 @@
                                 <w:sz w:val="20"/>
                               </w:rPr>
                             </w:pPr>
-                            <w:bookmarkStart w:id="101" w:name="_Toc227939336"/>
+                            <w:bookmarkStart w:id="104" w:name="_Toc227939336"/>
                             <w:r>
                               <w:t xml:space="preserve">Figura </w:t>
                             </w:r>
-                            <w:r>
-                              <w:fldChar w:fldCharType="begin"/>
-                            </w:r>
-                            <w:r>
-                              <w:instrText xml:space="preserve"> SEQ Figura \* ARABIC </w:instrText>
-                            </w:r>
-                            <w:r>
-                              <w:fldChar w:fldCharType="separate"/>
-                            </w:r>
-                            <w:r>
-                              <w:rPr>
-                                <w:noProof/>
-                              </w:rPr>
-                              <w:t>23</w:t>
-                            </w:r>
-                            <w:r>
-                              <w:fldChar w:fldCharType="end"/>
-                            </w:r>
+                            <w:fldSimple w:instr=" SEQ Figura \* ARABIC ">
+                              <w:r>
+                                <w:rPr>
+                                  <w:noProof/>
+                                </w:rPr>
+                                <w:t>23</w:t>
+                              </w:r>
+                            </w:fldSimple>
                             <w:r>
                               <w:t xml:space="preserve">: </w:t>
                             </w:r>
                             <w:r>
                               <w:t>Design e Interface</w:t>
                             </w:r>
-                            <w:bookmarkEnd w:id="101"/>
+                            <w:bookmarkEnd w:id="104"/>
                           </w:p>
                         </w:txbxContent>
                       </wps:txbx>
@@ -16246,35 +16381,25 @@
                           <w:sz w:val="20"/>
                         </w:rPr>
                       </w:pPr>
-                      <w:bookmarkStart w:id="104" w:name="_Toc227939336"/>
+                      <w:bookmarkStart w:id="105" w:name="_Toc227939336"/>
                       <w:r>
                         <w:t xml:space="preserve">Figura </w:t>
                       </w:r>
-                      <w:r>
-                        <w:fldChar w:fldCharType="begin"/>
-                      </w:r>
-                      <w:r>
-                        <w:instrText xml:space="preserve"> SEQ Figura \* ARABIC </w:instrText>
-                      </w:r>
-                      <w:r>
-                        <w:fldChar w:fldCharType="separate"/>
-                      </w:r>
-                      <w:r>
-                        <w:rPr>
-                          <w:noProof/>
-                        </w:rPr>
-                        <w:t>23</w:t>
-                      </w:r>
-                      <w:r>
-                        <w:fldChar w:fldCharType="end"/>
-                      </w:r>
+                      <w:fldSimple w:instr=" SEQ Figura \* ARABIC ">
+                        <w:r>
+                          <w:rPr>
+                            <w:noProof/>
+                          </w:rPr>
+                          <w:t>23</w:t>
+                        </w:r>
+                      </w:fldSimple>
                       <w:r>
                         <w:t xml:space="preserve">: </w:t>
                       </w:r>
                       <w:r>
                         <w:t>Design e Interface</w:t>
                       </w:r>
-                      <w:bookmarkEnd w:id="104"/>
+                      <w:bookmarkEnd w:id="105"/>
                     </w:p>
                   </w:txbxContent>
                 </v:textbox>
@@ -16420,35 +16545,25 @@
                                 <w:sz w:val="20"/>
                               </w:rPr>
                             </w:pPr>
-                            <w:bookmarkStart w:id="102" w:name="_Toc227939337"/>
+                            <w:bookmarkStart w:id="106" w:name="_Toc227939337"/>
                             <w:r>
                               <w:t xml:space="preserve">Figura </w:t>
                             </w:r>
-                            <w:r>
-                              <w:fldChar w:fldCharType="begin"/>
-                            </w:r>
-                            <w:r>
-                              <w:instrText xml:space="preserve"> SEQ Figura \* ARABIC </w:instrText>
-                            </w:r>
-                            <w:r>
-                              <w:fldChar w:fldCharType="separate"/>
-                            </w:r>
-                            <w:r>
-                              <w:rPr>
-                                <w:noProof/>
-                              </w:rPr>
-                              <w:t>24</w:t>
-                            </w:r>
-                            <w:r>
-                              <w:fldChar w:fldCharType="end"/>
-                            </w:r>
+                            <w:fldSimple w:instr=" SEQ Figura \* ARABIC ">
+                              <w:r>
+                                <w:rPr>
+                                  <w:noProof/>
+                                </w:rPr>
+                                <w:t>24</w:t>
+                              </w:r>
+                            </w:fldSimple>
                             <w:r>
                               <w:t xml:space="preserve">: </w:t>
                             </w:r>
                             <w:r>
                               <w:t>Leitura de Vagas</w:t>
                             </w:r>
-                            <w:bookmarkEnd w:id="102"/>
+                            <w:bookmarkEnd w:id="106"/>
                           </w:p>
                         </w:txbxContent>
                       </wps:txbx>
@@ -16478,35 +16593,25 @@
                           <w:sz w:val="20"/>
                         </w:rPr>
                       </w:pPr>
-                      <w:bookmarkStart w:id="106" w:name="_Toc227939337"/>
+                      <w:bookmarkStart w:id="107" w:name="_Toc227939337"/>
                       <w:r>
                         <w:t xml:space="preserve">Figura </w:t>
                       </w:r>
-                      <w:r>
-                        <w:fldChar w:fldCharType="begin"/>
-                      </w:r>
-                      <w:r>
-                        <w:instrText xml:space="preserve"> SEQ Figura \* ARABIC </w:instrText>
-                      </w:r>
-                      <w:r>
-                        <w:fldChar w:fldCharType="separate"/>
-                      </w:r>
-                      <w:r>
-                        <w:rPr>
-                          <w:noProof/>
-                        </w:rPr>
-                        <w:t>24</w:t>
-                      </w:r>
-                      <w:r>
-                        <w:fldChar w:fldCharType="end"/>
-                      </w:r>
+                      <w:fldSimple w:instr=" SEQ Figura \* ARABIC ">
+                        <w:r>
+                          <w:rPr>
+                            <w:noProof/>
+                          </w:rPr>
+                          <w:t>24</w:t>
+                        </w:r>
+                      </w:fldSimple>
                       <w:r>
                         <w:t xml:space="preserve">: </w:t>
                       </w:r>
                       <w:r>
                         <w:t>Leitura de Vagas</w:t>
                       </w:r>
-                      <w:bookmarkEnd w:id="106"/>
+                      <w:bookmarkEnd w:id="107"/>
                     </w:p>
                   </w:txbxContent>
                 </v:textbox>
@@ -16599,35 +16704,25 @@
         <w:pStyle w:val="Legenda"/>
         <w:keepNext/>
       </w:pPr>
-      <w:bookmarkStart w:id="103" w:name="_Toc227939338"/>
+      <w:bookmarkStart w:id="108" w:name="_Toc227939338"/>
       <w:r>
         <w:t xml:space="preserve">Figura </w:t>
       </w:r>
-      <w:r>
-        <w:fldChar w:fldCharType="begin"/>
-      </w:r>
-      <w:r>
-        <w:instrText xml:space="preserve"> SEQ Figura \* ARABIC </w:instrText>
-      </w:r>
-      <w:r>
-        <w:fldChar w:fldCharType="separate"/>
-      </w:r>
-      <w:r>
-        <w:rPr>
-          <w:noProof/>
-        </w:rPr>
-        <w:t>25</w:t>
-      </w:r>
-      <w:r>
-        <w:fldChar w:fldCharType="end"/>
-      </w:r>
+      <w:fldSimple w:instr=" SEQ Figura \* ARABIC ">
+        <w:r>
+          <w:rPr>
+            <w:noProof/>
+          </w:rPr>
+          <w:t>25</w:t>
+        </w:r>
+      </w:fldSimple>
       <w:r>
         <w:t xml:space="preserve">: </w:t>
       </w:r>
       <w:r>
         <w:t>Modernidade e Confiabilidade</w:t>
       </w:r>
-      <w:bookmarkEnd w:id="103"/>
+      <w:bookmarkEnd w:id="108"/>
     </w:p>
     <w:p/>
     <w:p>
@@ -16750,36 +16845,26 @@
         <w:pStyle w:val="Legenda"/>
         <w:keepNext/>
       </w:pPr>
-      <w:bookmarkStart w:id="104" w:name="_Toc227939339"/>
+      <w:bookmarkStart w:id="109" w:name="_Toc227939339"/>
       <w:r>
         <w:lastRenderedPageBreak/>
         <w:t xml:space="preserve">Figura </w:t>
       </w:r>
-      <w:r>
-        <w:fldChar w:fldCharType="begin"/>
-      </w:r>
-      <w:r>
-        <w:instrText xml:space="preserve"> SEQ Figura \* ARABIC </w:instrText>
-      </w:r>
-      <w:r>
-        <w:fldChar w:fldCharType="separate"/>
-      </w:r>
-      <w:r>
-        <w:rPr>
-          <w:noProof/>
-        </w:rPr>
-        <w:t>26</w:t>
-      </w:r>
-      <w:r>
-        <w:fldChar w:fldCharType="end"/>
-      </w:r>
+      <w:fldSimple w:instr=" SEQ Figura \* ARABIC ">
+        <w:r>
+          <w:rPr>
+            <w:noProof/>
+          </w:rPr>
+          <w:t>26</w:t>
+        </w:r>
+      </w:fldSimple>
       <w:r>
         <w:t xml:space="preserve">: </w:t>
       </w:r>
       <w:r>
         <w:t>Localização de Cadastro</w:t>
       </w:r>
-      <w:bookmarkEnd w:id="104"/>
+      <w:bookmarkEnd w:id="109"/>
     </w:p>
     <w:p/>
     <w:p>
@@ -16793,7 +16878,7 @@
           <w:sz w:val="20"/>
         </w:rPr>
         <w:drawing>
-          <wp:inline distT="0" distB="0" distL="0" distR="0" wp14:anchorId="3C654FAE" wp14:editId="6506901D">
+          <wp:inline distT="0" distB="0" distL="0" distR="0" wp14:anchorId="3C654FAE" wp14:editId="31FC0824">
             <wp:extent cx="4152900" cy="1571625"/>
             <wp:effectExtent l="0" t="0" r="0" b="9525"/>
             <wp:docPr id="1892766413" name="Image 4" descr="Gráfico de respostas do Google Formulários. Título da pergunta: 04 -  Em uma escala de 1 a 5, quão &quot;moderno&quot; e &quot;confiável&quot; o sistema parece ser?. Número de respostas: 10 respostas."/>
@@ -16854,7 +16939,7 @@
         <w:pStyle w:val="Legenda"/>
         <w:keepNext/>
       </w:pPr>
-      <w:bookmarkStart w:id="105" w:name="_Toc227939340"/>
+      <w:bookmarkStart w:id="110" w:name="_Toc227939340"/>
     </w:p>
     <w:p>
       <w:pPr>
@@ -16864,31 +16949,21 @@
       <w:r>
         <w:t xml:space="preserve">Figura </w:t>
       </w:r>
-      <w:r>
-        <w:fldChar w:fldCharType="begin"/>
-      </w:r>
-      <w:r>
-        <w:instrText xml:space="preserve"> SEQ Figura \* ARABIC </w:instrText>
-      </w:r>
-      <w:r>
-        <w:fldChar w:fldCharType="separate"/>
-      </w:r>
-      <w:r>
-        <w:rPr>
-          <w:noProof/>
-        </w:rPr>
-        <w:t>27</w:t>
-      </w:r>
-      <w:r>
-        <w:fldChar w:fldCharType="end"/>
-      </w:r>
+      <w:fldSimple w:instr=" SEQ Figura \* ARABIC ">
+        <w:r>
+          <w:rPr>
+            <w:noProof/>
+          </w:rPr>
+          <w:t>27</w:t>
+        </w:r>
+      </w:fldSimple>
       <w:r>
         <w:t xml:space="preserve">: </w:t>
       </w:r>
       <w:r>
         <w:t>Navegação</w:t>
       </w:r>
-      <w:bookmarkEnd w:id="105"/>
+      <w:bookmarkEnd w:id="110"/>
     </w:p>
     <w:p/>
     <w:p>
@@ -16908,7 +16983,7 @@
           <w:sz w:val="20"/>
         </w:rPr>
         <w:drawing>
-          <wp:inline distT="0" distB="0" distL="0" distR="0" wp14:anchorId="5A4BB88D" wp14:editId="5BA1B0C0">
+          <wp:inline distT="0" distB="0" distL="0" distR="0" wp14:anchorId="5A4BB88D" wp14:editId="32D86088">
             <wp:extent cx="4279879" cy="1785747"/>
             <wp:effectExtent l="0" t="0" r="6985" b="5080"/>
             <wp:docPr id="226253156" name="Image 6" descr="Gráfico de respostas do Google Formulários. Título da pergunta: 06 - A transição entre a tela de login e o painel principal foi rápida e compreensível?. Número de respostas: 10 respostas."/>
@@ -17010,35 +17085,25 @@
         </w:rPr>
         <w:t xml:space="preserve">                                   </w:t>
       </w:r>
-      <w:bookmarkStart w:id="106" w:name="_Toc227939341"/>
+      <w:bookmarkStart w:id="111" w:name="_Toc227939341"/>
       <w:r>
         <w:t xml:space="preserve">Figura </w:t>
       </w:r>
-      <w:r>
-        <w:fldChar w:fldCharType="begin"/>
-      </w:r>
-      <w:r>
-        <w:instrText xml:space="preserve"> SEQ Figura \* ARABIC </w:instrText>
-      </w:r>
-      <w:r>
-        <w:fldChar w:fldCharType="separate"/>
-      </w:r>
-      <w:r>
-        <w:rPr>
-          <w:noProof/>
-        </w:rPr>
-        <w:t>28</w:t>
-      </w:r>
-      <w:r>
-        <w:fldChar w:fldCharType="end"/>
-      </w:r>
+      <w:fldSimple w:instr=" SEQ Figura \* ARABIC ">
+        <w:r>
+          <w:rPr>
+            <w:noProof/>
+          </w:rPr>
+          <w:t>28</w:t>
+        </w:r>
+      </w:fldSimple>
       <w:r>
         <w:t xml:space="preserve">: </w:t>
       </w:r>
       <w:r>
         <w:t>Acessibilidade do Botão</w:t>
       </w:r>
-      <w:bookmarkEnd w:id="106"/>
+      <w:bookmarkEnd w:id="111"/>
     </w:p>
     <w:p>
       <w:pPr>
@@ -17118,35 +17183,25 @@
         <w:pStyle w:val="Legenda"/>
         <w:keepNext/>
       </w:pPr>
-      <w:bookmarkStart w:id="107" w:name="_Toc227939342"/>
+      <w:bookmarkStart w:id="112" w:name="_Toc227939342"/>
       <w:r>
         <w:t xml:space="preserve">Figura </w:t>
       </w:r>
-      <w:r>
-        <w:fldChar w:fldCharType="begin"/>
-      </w:r>
-      <w:r>
-        <w:instrText xml:space="preserve"> SEQ Figura \* ARABIC </w:instrText>
-      </w:r>
-      <w:r>
-        <w:fldChar w:fldCharType="separate"/>
-      </w:r>
-      <w:r>
-        <w:rPr>
-          <w:noProof/>
-        </w:rPr>
-        <w:t>29</w:t>
-      </w:r>
-      <w:r>
-        <w:fldChar w:fldCharType="end"/>
-      </w:r>
+      <w:fldSimple w:instr=" SEQ Figura \* ARABIC ">
+        <w:r>
+          <w:rPr>
+            <w:noProof/>
+          </w:rPr>
+          <w:t>29</w:t>
+        </w:r>
+      </w:fldSimple>
       <w:r>
         <w:t xml:space="preserve">: </w:t>
       </w:r>
       <w:r>
         <w:t>Sugestões de Melhoria</w:t>
       </w:r>
-      <w:bookmarkEnd w:id="107"/>
+      <w:bookmarkEnd w:id="112"/>
     </w:p>
     <w:p>
       <w:pPr>
@@ -17283,35 +17338,25 @@
         <w:pStyle w:val="Legenda"/>
         <w:keepNext/>
       </w:pPr>
-      <w:bookmarkStart w:id="108" w:name="_Toc227939343"/>
+      <w:bookmarkStart w:id="113" w:name="_Toc227939343"/>
       <w:r>
         <w:t xml:space="preserve">Figura </w:t>
       </w:r>
-      <w:r>
-        <w:fldChar w:fldCharType="begin"/>
-      </w:r>
-      <w:r>
-        <w:instrText xml:space="preserve"> SEQ Figura \* ARABIC </w:instrText>
-      </w:r>
-      <w:r>
-        <w:fldChar w:fldCharType="separate"/>
-      </w:r>
-      <w:r>
-        <w:rPr>
-          <w:noProof/>
-        </w:rPr>
-        <w:t>30</w:t>
-      </w:r>
-      <w:r>
-        <w:fldChar w:fldCharType="end"/>
-      </w:r>
+      <w:fldSimple w:instr=" SEQ Figura \* ARABIC ">
+        <w:r>
+          <w:rPr>
+            <w:noProof/>
+          </w:rPr>
+          <w:t>30</w:t>
+        </w:r>
+      </w:fldSimple>
       <w:r>
         <w:t xml:space="preserve">: </w:t>
       </w:r>
       <w:r>
         <w:t>Recomendação</w:t>
       </w:r>
-      <w:bookmarkEnd w:id="108"/>
+      <w:bookmarkEnd w:id="113"/>
     </w:p>
     <w:p/>
     <w:p>
@@ -17330,7 +17375,7 @@
           <w:sz w:val="20"/>
         </w:rPr>
         <w:drawing>
-          <wp:inline distT="0" distB="0" distL="0" distR="0" wp14:anchorId="0D4BCC9C" wp14:editId="28C2FE47">
+          <wp:inline distT="0" distB="0" distL="0" distR="0" wp14:anchorId="0D4BCC9C" wp14:editId="2FB44C1A">
             <wp:extent cx="4555039" cy="1785747"/>
             <wp:effectExtent l="0" t="0" r="0" b="5080"/>
             <wp:docPr id="9" name="Image 9" descr="Gráfico de respostas do Google Formulários. Título da pergunta: 09 -   Você recomendaria o uso deste portal para outros colegas ou empresas da região?. Número de respostas: 10 respostas."/>
@@ -17408,34 +17453,33 @@
         <w:pStyle w:val="Ttulo1"/>
         <w:ind w:left="0" w:firstLine="0"/>
       </w:pPr>
-      <w:bookmarkStart w:id="109" w:name="_Toc227939371"/>
+      <w:bookmarkStart w:id="114" w:name="_Hlk228613531"/>
+      <w:bookmarkStart w:id="115" w:name="_Toc228614408"/>
       <w:r>
         <w:lastRenderedPageBreak/>
-        <w:t>CONCLUSÃO</w:t>
-      </w:r>
-      <w:bookmarkEnd w:id="109"/>
-    </w:p>
-    <w:p>
-      <w:r>
-        <w:t>Durante a fase de testes, o</w:t>
-      </w:r>
-      <w:r>
-        <w:t xml:space="preserve">s testes de usabilidade </w:t>
-      </w:r>
-      <w:r>
-        <w:t>mostraram</w:t>
-      </w:r>
-      <w:r>
-        <w:t xml:space="preserve"> que a interface desenvolvida é intuitiva e funcional, facilitando o entendimento e a navegação por parte dos estudantes, que são os principais usuários do sistema.</w:t>
-      </w:r>
-      <w:r>
-        <w:t xml:space="preserve"> Além disso, f</w:t>
-      </w:r>
-      <w:r>
-        <w:t>oi observado</w:t>
-      </w:r>
-      <w:r>
-        <w:t xml:space="preserve"> que a aplicação da </w:t>
+        <w:t>CONCLUS</w:t>
+      </w:r>
+      <w:r>
+        <w:t>ÕES</w:t>
+      </w:r>
+      <w:r>
+        <w:t xml:space="preserve"> </w:t>
+      </w:r>
+      <w:r>
+        <w:t xml:space="preserve">e </w:t>
+      </w:r>
+      <w:r>
+        <w:t>TRABALHOS FUTUROS</w:t>
+      </w:r>
+      <w:bookmarkEnd w:id="115"/>
+    </w:p>
+    <w:bookmarkEnd w:id="114"/>
+    <w:p>
+      <w:r>
+        <w:t xml:space="preserve">Os resultados obtidos mostram que </w:t>
+      </w:r>
+      <w:r>
+        <w:t xml:space="preserve">a aplicação da </w:t>
       </w:r>
       <w:r>
         <w:t xml:space="preserve">metodologia </w:t>
@@ -17457,19 +17501,49 @@
       </w:r>
       <w:proofErr w:type="spellEnd"/>
       <w:r>
-        <w:t xml:space="preserve"> permitiu</w:t>
-      </w:r>
-      <w:r>
-        <w:t xml:space="preserve"> que o desenvolvedor </w:t>
+        <w:t xml:space="preserve"> </w:t>
+      </w:r>
+      <w:r>
+        <w:t xml:space="preserve">ajuda o desenvolvedor a </w:t>
       </w:r>
       <w:r>
         <w:t>compreende</w:t>
       </w:r>
       <w:r>
-        <w:t>sse</w:t>
-      </w:r>
-      <w:r>
-        <w:t xml:space="preserve"> profundamente as necessidades reais dos alunos, resultando em uma plataforma que prioriza a experiência do usuário (UX) e a estética visual (UI). </w:t>
+        <w:t>r as</w:t>
+      </w:r>
+      <w:r>
+        <w:t xml:space="preserve"> necessidades reais dos </w:t>
+      </w:r>
+      <w:r>
+        <w:t>usuários</w:t>
+      </w:r>
+      <w:r>
+        <w:t xml:space="preserve">, resultando em um produto que prioriza a experiência do usuário (UX) e a estética visual (UI). </w:t>
+      </w:r>
+      <w:r>
+        <w:t>Essa afirmação é corroborada, principalmente, durante</w:t>
+      </w:r>
+      <w:r>
+        <w:t xml:space="preserve"> a fase de testes, </w:t>
+      </w:r>
+      <w:r>
+        <w:t xml:space="preserve">onde </w:t>
+      </w:r>
+      <w:r>
+        <w:t>o</w:t>
+      </w:r>
+      <w:r>
+        <w:t xml:space="preserve">s testes de usabilidade </w:t>
+      </w:r>
+      <w:r>
+        <w:t>mostraram</w:t>
+      </w:r>
+      <w:r>
+        <w:t xml:space="preserve"> que a interface desenvolvida é intuitiva e funcional, facilitando o entendimento e a navegação por parte dos estudantes, que são os principais usuários do sistema.</w:t>
+      </w:r>
+      <w:r>
+        <w:t xml:space="preserve"> </w:t>
       </w:r>
     </w:p>
     <w:p>
@@ -17534,7 +17608,13 @@
         <w:t xml:space="preserve"> protótipo</w:t>
       </w:r>
       <w:r>
-        <w:t xml:space="preserve"> seria a implementação completa do </w:t>
+        <w:t xml:space="preserve"> </w:t>
+      </w:r>
+      <w:r>
+        <w:t xml:space="preserve">por meio da </w:t>
+      </w:r>
+      <w:r>
+        <w:t xml:space="preserve">implementação completa do </w:t>
       </w:r>
       <w:proofErr w:type="spellStart"/>
       <w:r>
@@ -17546,7 +17626,19 @@
       </w:r>
       <w:proofErr w:type="spellEnd"/>
       <w:r>
-        <w:t xml:space="preserve"> para que a plataforma deixe de ser apenas um protótipo funcional e se torne uma ferramenta oficial e definitiva da instituição</w:t>
+        <w:t xml:space="preserve">, evoluindo o </w:t>
+      </w:r>
+      <w:r>
+        <w:t xml:space="preserve">protótipo funcional </w:t>
+      </w:r>
+      <w:r>
+        <w:t xml:space="preserve">para </w:t>
+      </w:r>
+      <w:r>
+        <w:t>uma ferramenta oficial e definitiva da instituição</w:t>
+      </w:r>
+      <w:r>
+        <w:t>.</w:t>
       </w:r>
     </w:p>
     <w:p>
@@ -17701,7 +17793,7 @@
       <w:r>
         <w:t xml:space="preserve"> fator determinante para o sucesso da formação profissional e para a futura inserção dos alunos no mercado de trabalho.</w:t>
       </w:r>
-      <w:bookmarkStart w:id="110" w:name="_Toc175908738"/>
+      <w:bookmarkStart w:id="116" w:name="_Toc175908738"/>
     </w:p>
     <w:p>
       <w:r>
@@ -17749,7 +17841,7 @@
           <w:rFonts w:eastAsiaTheme="majorEastAsia"/>
         </w:rPr>
       </w:pPr>
-      <w:bookmarkStart w:id="111" w:name="_Toc227939372"/>
+      <w:bookmarkStart w:id="117" w:name="_Toc228614409"/>
       <w:r>
         <w:rPr>
           <w:rStyle w:val="Ttulo1Char"/>
@@ -17760,11 +17852,11 @@
         <w:lastRenderedPageBreak/>
         <w:t>REFERÊNCIAS Bibliográficas</w:t>
       </w:r>
-      <w:bookmarkEnd w:id="110"/>
-      <w:bookmarkEnd w:id="111"/>
-    </w:p>
-    <w:bookmarkStart w:id="112" w:name="_Toc175218603" w:displacedByCustomXml="next"/>
-    <w:bookmarkStart w:id="113" w:name="_Toc175231793" w:displacedByCustomXml="next"/>
+      <w:bookmarkEnd w:id="116"/>
+      <w:bookmarkEnd w:id="117"/>
+    </w:p>
+    <w:bookmarkStart w:id="118" w:name="_Toc175218603" w:displacedByCustomXml="next"/>
+    <w:bookmarkStart w:id="119" w:name="_Toc175231793" w:displacedByCustomXml="next"/>
     <w:sdt>
       <w:sdtPr>
         <w:id w:val="72499945"/>
@@ -17774,8 +17866,8 @@
         </w:docPartObj>
       </w:sdtPr>
       <w:sdtContent>
-        <w:bookmarkEnd w:id="113" w:displacedByCustomXml="prev"/>
-        <w:bookmarkEnd w:id="112" w:displacedByCustomXml="prev"/>
+        <w:bookmarkEnd w:id="119" w:displacedByCustomXml="prev"/>
+        <w:bookmarkEnd w:id="118" w:displacedByCustomXml="prev"/>
         <w:p>
           <w:pPr>
             <w:pStyle w:val="Bibliografia"/>
@@ -17795,7 +17887,7 @@
           <w:r>
             <w:fldChar w:fldCharType="separate"/>
           </w:r>
-          <w:bookmarkStart w:id="114" w:name="Den15"/>
+          <w:bookmarkStart w:id="120" w:name="Den15"/>
           <w:r>
             <w:rPr>
               <w:noProof/>
@@ -17816,7 +17908,7 @@
             </w:rPr>
             <w:t xml:space="preserve"> An Object Oriented Approach with UML. 5ª. ed. [S.l.]: Wiley, 2015.</w:t>
           </w:r>
-          <w:bookmarkEnd w:id="114"/>
+          <w:bookmarkEnd w:id="120"/>
         </w:p>
         <w:p>
           <w:pPr>
@@ -17825,7 +17917,7 @@
               <w:noProof/>
             </w:rPr>
           </w:pPr>
-          <w:bookmarkStart w:id="115" w:name="Lar01"/>
+          <w:bookmarkStart w:id="121" w:name="Lar01"/>
           <w:r>
             <w:rPr>
               <w:noProof/>
@@ -17846,7 +17938,7 @@
             </w:rPr>
             <w:t xml:space="preserve"> An Introduction to Object-Oriented Analysis and Design and the Unified Process. 2ª. ed. [S.l.]: Prentice Hall, 2001. 616 p.</w:t>
           </w:r>
-          <w:bookmarkEnd w:id="115"/>
+          <w:bookmarkEnd w:id="121"/>
         </w:p>
         <w:p>
           <w:pPr>
@@ -17855,14 +17947,14 @@
               <w:noProof/>
             </w:rPr>
           </w:pPr>
-          <w:bookmarkStart w:id="116" w:name="Nun20"/>
+          <w:bookmarkStart w:id="122" w:name="Nun20"/>
           <w:r>
             <w:rPr>
               <w:noProof/>
             </w:rPr>
             <w:t>Nunes, Daila B.; Guerra, Lucieli B.; Correa, Claiton M. Design Thinking como Metodologia para Definição Interface Gráfica de Usuário, São Borja, julho 2020. 4.</w:t>
           </w:r>
-          <w:bookmarkEnd w:id="116"/>
+          <w:bookmarkEnd w:id="122"/>
         </w:p>
         <w:p>
           <w:pPr>
@@ -17871,7 +17963,7 @@
               <w:noProof/>
             </w:rPr>
           </w:pPr>
-          <w:bookmarkStart w:id="117" w:name="Rog15"/>
+          <w:bookmarkStart w:id="123" w:name="Rog15"/>
           <w:r>
             <w:rPr>
               <w:noProof/>
@@ -17892,7 +17984,7 @@
             </w:rPr>
             <w:t xml:space="preserve"> A practitioner's approach. 8ª. ed. New York: McGraw-Hill Education, 2015.</w:t>
           </w:r>
-          <w:bookmarkEnd w:id="117"/>
+          <w:bookmarkEnd w:id="123"/>
         </w:p>
         <w:p>
           <w:pPr>
@@ -17901,7 +17993,7 @@
               <w:noProof/>
             </w:rPr>
           </w:pPr>
-          <w:bookmarkStart w:id="118" w:name="Som16"/>
+          <w:bookmarkStart w:id="124" w:name="Som16"/>
           <w:r>
             <w:rPr>
               <w:noProof/>
@@ -17922,7 +18014,7 @@
             </w:rPr>
             <w:t>. 9ª. ed. [S.l.]: Pearson Education, 2011.</w:t>
           </w:r>
-          <w:bookmarkEnd w:id="118"/>
+          <w:bookmarkEnd w:id="124"/>
         </w:p>
         <w:p>
           <w:pPr>
@@ -18539,9 +18631,9 @@
         </w:p>
       </w:sdtContent>
     </w:sdt>
-    <w:bookmarkEnd w:id="72" w:displacedByCustomXml="prev"/>
     <w:bookmarkEnd w:id="71" w:displacedByCustomXml="prev"/>
     <w:bookmarkEnd w:id="70" w:displacedByCustomXml="prev"/>
+    <w:bookmarkEnd w:id="69" w:displacedByCustomXml="prev"/>
     <w:bookmarkEnd w:id="36" w:displacedByCustomXml="prev"/>
     <w:bookmarkEnd w:id="35" w:displacedByCustomXml="prev"/>
     <w:bookmarkEnd w:id="34" w:displacedByCustomXml="prev"/>
@@ -23144,11 +23236,10 @@
     <w:basedOn w:val="Normal"/>
     <w:uiPriority w:val="34"/>
     <w:qFormat/>
-    <w:rsid w:val="00801011"/>
+    <w:rsid w:val="00D74335"/>
     <w:pPr>
       <w:ind w:left="720"/>
       <w:contextualSpacing/>
-      <w:jc w:val="left"/>
     </w:pPr>
     <w:rPr>
       <w:rFonts w:eastAsia="Times New Roman"/>

</xml_diff>